<commit_message>
Update Project Report_Dagents project.docx
</commit_message>
<xml_diff>
--- a/Project Report_Dagents project.docx
+++ b/Project Report_Dagents project.docx
@@ -98,7 +98,7 @@
       <w:pPr>
         <w:numPr>
           <w:ilvl w:val="0"/>
-          <w:numId w:val="1"/>
+          <w:numId w:val="3"/>
         </w:numPr>
         <w:pBdr>
           <w:top w:space="0" w:sz="0" w:val="nil"/>
@@ -132,7 +132,7 @@
       <w:pPr>
         <w:numPr>
           <w:ilvl w:val="0"/>
-          <w:numId w:val="1"/>
+          <w:numId w:val="3"/>
         </w:numPr>
         <w:pBdr>
           <w:top w:space="0" w:sz="0" w:val="nil"/>
@@ -369,7 +369,7 @@
       <w:pPr>
         <w:numPr>
           <w:ilvl w:val="0"/>
-          <w:numId w:val="2"/>
+          <w:numId w:val="4"/>
         </w:numPr>
         <w:pBdr>
           <w:top w:space="0" w:sz="0" w:val="nil"/>
@@ -425,7 +425,7 @@
       <w:pPr>
         <w:numPr>
           <w:ilvl w:val="0"/>
-          <w:numId w:val="2"/>
+          <w:numId w:val="4"/>
         </w:numPr>
         <w:pBdr>
           <w:top w:space="0" w:sz="0" w:val="nil"/>
@@ -478,7 +478,7 @@
       <w:pPr>
         <w:numPr>
           <w:ilvl w:val="0"/>
-          <w:numId w:val="2"/>
+          <w:numId w:val="4"/>
         </w:numPr>
         <w:pBdr>
           <w:top w:space="0" w:sz="0" w:val="nil"/>
@@ -531,7 +531,7 @@
       <w:pPr>
         <w:numPr>
           <w:ilvl w:val="0"/>
-          <w:numId w:val="2"/>
+          <w:numId w:val="4"/>
         </w:numPr>
         <w:pBdr>
           <w:top w:space="0" w:sz="0" w:val="nil"/>
@@ -620,7 +620,7 @@
       <w:pPr>
         <w:numPr>
           <w:ilvl w:val="0"/>
-          <w:numId w:val="3"/>
+          <w:numId w:val="5"/>
         </w:numPr>
         <w:pBdr>
           <w:top w:space="0" w:sz="0" w:val="nil"/>
@@ -654,7 +654,7 @@
       <w:pPr>
         <w:numPr>
           <w:ilvl w:val="0"/>
-          <w:numId w:val="3"/>
+          <w:numId w:val="5"/>
         </w:numPr>
         <w:pBdr>
           <w:top w:space="0" w:sz="0" w:val="nil"/>
@@ -707,7 +707,7 @@
       <w:pPr>
         <w:numPr>
           <w:ilvl w:val="0"/>
-          <w:numId w:val="3"/>
+          <w:numId w:val="5"/>
         </w:numPr>
         <w:pBdr>
           <w:top w:space="0" w:sz="0" w:val="nil"/>
@@ -835,7 +835,7 @@
       <w:pPr>
         <w:numPr>
           <w:ilvl w:val="0"/>
-          <w:numId w:val="4"/>
+          <w:numId w:val="6"/>
         </w:numPr>
         <w:pBdr>
           <w:top w:space="0" w:sz="0" w:val="nil"/>
@@ -888,7 +888,7 @@
       <w:pPr>
         <w:numPr>
           <w:ilvl w:val="0"/>
-          <w:numId w:val="4"/>
+          <w:numId w:val="6"/>
         </w:numPr>
         <w:pBdr>
           <w:top w:space="0" w:sz="0" w:val="nil"/>
@@ -941,7 +941,7 @@
       <w:pPr>
         <w:numPr>
           <w:ilvl w:val="0"/>
-          <w:numId w:val="4"/>
+          <w:numId w:val="6"/>
         </w:numPr>
         <w:pBdr>
           <w:top w:space="0" w:sz="0" w:val="nil"/>
@@ -968,7 +968,7 @@
       <w:pPr>
         <w:numPr>
           <w:ilvl w:val="1"/>
-          <w:numId w:val="5"/>
+          <w:numId w:val="7"/>
         </w:numPr>
         <w:pBdr>
           <w:top w:space="0" w:sz="0" w:val="nil"/>
@@ -1021,7 +1021,7 @@
       <w:pPr>
         <w:numPr>
           <w:ilvl w:val="1"/>
-          <w:numId w:val="5"/>
+          <w:numId w:val="7"/>
         </w:numPr>
         <w:pBdr>
           <w:top w:space="0" w:sz="0" w:val="nil"/>
@@ -1048,7 +1048,7 @@
           <w:rFonts w:ascii="Google Sans" w:cs="Google Sans" w:eastAsia="Google Sans" w:hAnsi="Google Sans"/>
           <w:rtl w:val="0"/>
         </w:rPr>
-        <w:t xml:space="preserve"> We used LoRA (Low-Rank Adaptation) targeting the attention projections (q_proj, k_proj, v_proj, o_proj, etc.) with rank $r=16$ and $\alpha=32$.</w:t>
+        <w:t xml:space="preserve"> We used LoRA (Low-Rank Adaptation) targeting the attention projections (q_proj, k_proj, v_proj, o_proj, etc.) with rank r=16 and alpha=32.</w:t>
       </w:r>
       <w:r>
         <w:rPr>
@@ -1074,7 +1074,7 @@
       <w:pPr>
         <w:numPr>
           <w:ilvl w:val="1"/>
-          <w:numId w:val="5"/>
+          <w:numId w:val="7"/>
         </w:numPr>
         <w:pBdr>
           <w:top w:space="0" w:sz="0" w:val="nil"/>
@@ -1127,7 +1127,7 @@
       <w:pPr>
         <w:numPr>
           <w:ilvl w:val="1"/>
-          <w:numId w:val="5"/>
+          <w:numId w:val="7"/>
         </w:numPr>
         <w:pBdr>
           <w:top w:space="0" w:sz="0" w:val="nil"/>
@@ -1230,6 +1230,684 @@
     </w:p>
     <w:p>
       <w:pPr>
+        <w:spacing w:after="240" w:line="275.9999942779541" w:lineRule="auto"/>
+        <w:rPr>
+          <w:rFonts w:ascii="Google Sans" w:cs="Google Sans" w:eastAsia="Google Sans" w:hAnsi="Google Sans"/>
+        </w:rPr>
+      </w:pPr>
+      <w:r>
+        <w:rPr>
+          <w:rFonts w:ascii="Google Sans" w:cs="Google Sans" w:eastAsia="Google Sans" w:hAnsi="Google Sans"/>
+          <w:rtl w:val="0"/>
+        </w:rPr>
+        <w:t xml:space="preserve">Our evaluation strategy utilized two primary string-based metrics: </w:t>
+      </w:r>
+      <w:r>
+        <w:rPr>
+          <w:rFonts w:ascii="Google Sans" w:cs="Google Sans" w:eastAsia="Google Sans" w:hAnsi="Google Sans"/>
+          <w:b w:val="1"/>
+          <w:bCs w:val="1"/>
+          <w:rtl w:val="0"/>
+        </w:rPr>
+        <w:t xml:space="preserve">Exact Match (EM)</w:t>
+      </w:r>
+      <w:r>
+        <w:rPr>
+          <w:rFonts w:ascii="Google Sans" w:cs="Google Sans" w:eastAsia="Google Sans" w:hAnsi="Google Sans"/>
+          <w:rtl w:val="0"/>
+        </w:rPr>
+        <w:t xml:space="preserve"> (did the output perfectly mirror the ground truth?) and </w:t>
+      </w:r>
+      <w:r>
+        <w:rPr>
+          <w:rFonts w:ascii="Google Sans" w:cs="Google Sans" w:eastAsia="Google Sans" w:hAnsi="Google Sans"/>
+          <w:b w:val="1"/>
+          <w:bCs w:val="1"/>
+          <w:rtl w:val="0"/>
+        </w:rPr>
+        <w:t xml:space="preserve">Proximal Match / Jaccard Token Similarity</w:t>
+      </w:r>
+      <w:r>
+        <w:rPr>
+          <w:rFonts w:ascii="Google Sans" w:cs="Google Sans" w:eastAsia="Google Sans" w:hAnsi="Google Sans"/>
+          <w:rtl w:val="0"/>
+        </w:rPr>
+        <w:t xml:space="preserve"> (did the output use the correct keywords, tables, and columns, even if aliased differently?).</w:t>
+      </w:r>
+    </w:p>
+    <w:p>
+      <w:pPr>
+        <w:spacing w:after="240" w:before="240" w:line="275.9999942779541" w:lineRule="auto"/>
+        <w:rPr>
+          <w:rFonts w:ascii="Google Sans" w:cs="Google Sans" w:eastAsia="Google Sans" w:hAnsi="Google Sans"/>
+        </w:rPr>
+      </w:pPr>
+      <w:r>
+        <w:rPr>
+          <w:rFonts w:ascii="Google Sans" w:cs="Google Sans" w:eastAsia="Google Sans" w:hAnsi="Google Sans"/>
+          <w:b w:val="1"/>
+          <w:bCs w:val="1"/>
+          <w:rtl w:val="0"/>
+        </w:rPr>
+        <w:t xml:space="preserve">1. CodeT5+ (770M) Evaluation:</w:t>
+      </w:r>
+      <w:r>
+        <w:rPr>
+          <w:rFonts w:ascii="Google Sans" w:cs="Google Sans" w:eastAsia="Google Sans" w:hAnsi="Google Sans"/>
+          <w:rtl w:val="0"/>
+        </w:rPr>
+        <w:t xml:space="preserve"> The 770M parameter model provided a textbook case study in "Distribution Alignment" versus "Domain Shift."</w:t>
+      </w:r>
+    </w:p>
+    <w:p>
+      <w:pPr>
+        <w:numPr>
+          <w:ilvl w:val="0"/>
+          <w:numId w:val="2"/>
+        </w:numPr>
+        <w:spacing w:after="0" w:afterAutospacing="0" w:before="240" w:line="275.9999942779541" w:lineRule="auto"/>
+        <w:ind w:left="720" w:hanging="360"/>
+        <w:rPr>
+          <w:rFonts w:ascii="Google Sans" w:cs="Google Sans" w:eastAsia="Google Sans" w:hAnsi="Google Sans"/>
+        </w:rPr>
+      </w:pPr>
+      <w:r>
+        <w:rPr>
+          <w:rFonts w:ascii="Google Sans" w:cs="Google Sans" w:eastAsia="Google Sans" w:hAnsi="Google Sans"/>
+          <w:b w:val="1"/>
+          <w:bCs w:val="1"/>
+          <w:rtl w:val="0"/>
+        </w:rPr>
+        <w:t xml:space="preserve">In-Distribution (sql-create-context):</w:t>
+      </w:r>
+      <w:r>
+        <w:rPr>
+          <w:rFonts w:ascii="Google Sans" w:cs="Google Sans" w:eastAsia="Google Sans" w:hAnsi="Google Sans"/>
+          <w:rtl w:val="0"/>
+        </w:rPr>
+        <w:t xml:space="preserve"> Achieved </w:t>
+      </w:r>
+      <w:r>
+        <w:rPr>
+          <w:rFonts w:ascii="Google Sans" w:cs="Google Sans" w:eastAsia="Google Sans" w:hAnsi="Google Sans"/>
+          <w:b w:val="1"/>
+          <w:bCs w:val="1"/>
+          <w:rtl w:val="0"/>
+        </w:rPr>
+        <w:t xml:space="preserve">75.00% Exact Match</w:t>
+      </w:r>
+      <w:r>
+        <w:rPr>
+          <w:rFonts w:ascii="Google Sans" w:cs="Google Sans" w:eastAsia="Google Sans" w:hAnsi="Google Sans"/>
+          <w:rtl w:val="0"/>
+        </w:rPr>
+        <w:t xml:space="preserve">. The model was highly comfortable when the DDL format and question style matched the 20,000 samples it was trained on.</w:t>
+      </w:r>
+    </w:p>
+    <w:p>
+      <w:pPr>
+        <w:numPr>
+          <w:ilvl w:val="0"/>
+          <w:numId w:val="2"/>
+        </w:numPr>
+        <w:spacing w:after="240" w:before="0" w:beforeAutospacing="0" w:line="275.9999942779541" w:lineRule="auto"/>
+        <w:ind w:left="720" w:hanging="360"/>
+        <w:rPr>
+          <w:rFonts w:ascii="Google Sans" w:cs="Google Sans" w:eastAsia="Google Sans" w:hAnsi="Google Sans"/>
+        </w:rPr>
+      </w:pPr>
+      <w:r>
+        <w:rPr>
+          <w:rFonts w:ascii="Google Sans" w:cs="Google Sans" w:eastAsia="Google Sans" w:hAnsi="Google Sans"/>
+          <w:b w:val="1"/>
+          <w:bCs w:val="1"/>
+          <w:rtl w:val="0"/>
+        </w:rPr>
+        <w:t xml:space="preserve">Out-of-Distribution (WikiSQL):</w:t>
+      </w:r>
+      <w:r>
+        <w:rPr>
+          <w:rFonts w:ascii="Google Sans" w:cs="Google Sans" w:eastAsia="Google Sans" w:hAnsi="Google Sans"/>
+          <w:rtl w:val="0"/>
+        </w:rPr>
+        <w:t xml:space="preserve"> The model completely collapsed, scoring </w:t>
+      </w:r>
+      <w:r>
+        <w:rPr>
+          <w:rFonts w:ascii="Google Sans" w:cs="Google Sans" w:eastAsia="Google Sans" w:hAnsi="Google Sans"/>
+          <w:b w:val="1"/>
+          <w:bCs w:val="1"/>
+          <w:rtl w:val="0"/>
+        </w:rPr>
+        <w:t xml:space="preserve">0.00%</w:t>
+      </w:r>
+      <w:r>
+        <w:rPr>
+          <w:rFonts w:ascii="Google Sans" w:cs="Google Sans" w:eastAsia="Google Sans" w:hAnsi="Google Sans"/>
+          <w:rtl w:val="0"/>
+        </w:rPr>
+        <w:t xml:space="preserve">. When faced with WikiSQL's "messy," single-table headers, the model's internal mapping broke down, proving it had memorized the training task structure rather than fundamentally learning SQL logic.</w:t>
+      </w:r>
+    </w:p>
+    <w:p>
+      <w:pPr>
+        <w:spacing w:after="240" w:before="240" w:line="275.9999942779541" w:lineRule="auto"/>
+        <w:rPr>
+          <w:rFonts w:ascii="Google Sans" w:cs="Google Sans" w:eastAsia="Google Sans" w:hAnsi="Google Sans"/>
+        </w:rPr>
+      </w:pPr>
+      <w:r>
+        <w:rPr>
+          <w:rFonts w:ascii="Google Sans" w:cs="Google Sans" w:eastAsia="Google Sans" w:hAnsi="Google Sans"/>
+          <w:b w:val="1"/>
+          <w:bCs w:val="1"/>
+          <w:rtl w:val="0"/>
+        </w:rPr>
+        <w:t xml:space="preserve">2. CodeQwen 1.5 (7B) Evaluation &amp; The 88% Illusion:</w:t>
+      </w:r>
+      <w:r>
+        <w:rPr>
+          <w:rFonts w:ascii="Google Sans" w:cs="Google Sans" w:eastAsia="Google Sans" w:hAnsi="Google Sans"/>
+          <w:rtl w:val="0"/>
+        </w:rPr>
+        <w:t xml:space="preserve"> By upgrading to the 7B decoder-only architecture, implementing DDL-aware inference, and introducing negative sampling, we successfully broke the zero-shot barrier on the highly complex Spider dataset. The model achieved an </w:t>
+      </w:r>
+      <w:r>
+        <w:rPr>
+          <w:rFonts w:ascii="Google Sans" w:cs="Google Sans" w:eastAsia="Google Sans" w:hAnsi="Google Sans"/>
+          <w:b w:val="1"/>
+          <w:bCs w:val="1"/>
+          <w:rtl w:val="0"/>
+        </w:rPr>
+        <w:t xml:space="preserve">Exact Match of 12.00%</w:t>
+      </w:r>
+      <w:r>
+        <w:rPr>
+          <w:rFonts w:ascii="Google Sans" w:cs="Google Sans" w:eastAsia="Google Sans" w:hAnsi="Google Sans"/>
+          <w:rtl w:val="0"/>
+        </w:rPr>
+        <w:t xml:space="preserve"> and a </w:t>
+      </w:r>
+      <w:r>
+        <w:rPr>
+          <w:rFonts w:ascii="Google Sans" w:cs="Google Sans" w:eastAsia="Google Sans" w:hAnsi="Google Sans"/>
+          <w:b w:val="1"/>
+          <w:bCs w:val="1"/>
+          <w:rtl w:val="0"/>
+        </w:rPr>
+        <w:t xml:space="preserve">Proximal Match of 50.89%</w:t>
+      </w:r>
+      <w:r>
+        <w:rPr>
+          <w:rFonts w:ascii="Google Sans" w:cs="Google Sans" w:eastAsia="Google Sans" w:hAnsi="Google Sans"/>
+          <w:rtl w:val="0"/>
+        </w:rPr>
+        <w:t xml:space="preserve">.</w:t>
+      </w:r>
+    </w:p>
+    <w:p>
+      <w:pPr>
+        <w:spacing w:after="240" w:before="240" w:line="275.9999942779541" w:lineRule="auto"/>
+        <w:rPr>
+          <w:rFonts w:ascii="Google Sans" w:cs="Google Sans" w:eastAsia="Google Sans" w:hAnsi="Google Sans"/>
+        </w:rPr>
+      </w:pPr>
+      <w:r>
+        <w:rPr>
+          <w:rFonts w:ascii="Google Sans" w:cs="Google Sans" w:eastAsia="Google Sans" w:hAnsi="Google Sans"/>
+          <w:rtl w:val="0"/>
+        </w:rPr>
+        <w:t xml:space="preserve">While an 88% EM failure rate appears high, a qualitative diagnostic breakdown of the outputs revealed that the metric itself is highly deceptive. We classified the model's outputs into three distinct evaluation buckets to understand the true nature of these "failures":</w:t>
+      </w:r>
+    </w:p>
+    <w:p>
+      <w:pPr>
+        <w:pStyle w:val="Heading4"/>
+        <w:spacing w:after="40" w:before="240" w:line="275.9999942779541" w:lineRule="auto"/>
+        <w:rPr>
+          <w:rFonts w:ascii="Google Sans" w:cs="Google Sans" w:eastAsia="Google Sans" w:hAnsi="Google Sans"/>
+          <w:sz w:val="22"/>
+          <w:szCs w:val="22"/>
+        </w:rPr>
+      </w:pPr>
+      <w:bookmarkStart w:colFirst="0" w:colLast="0" w:name="_s0p9j3fua9ul" w:id="0"/>
+      <w:bookmarkEnd w:id="0"/>
+      <w:r>
+        <w:rPr>
+          <w:rFonts w:ascii="Google Sans" w:cs="Google Sans" w:eastAsia="Google Sans" w:hAnsi="Google Sans"/>
+          <w:sz w:val="22"/>
+          <w:szCs w:val="22"/>
+          <w:rtl w:val="0"/>
+        </w:rPr>
+        <w:t xml:space="preserve">NOTE: The Evaluation Typology (A, B, C)</w:t>
+      </w:r>
+    </w:p>
+    <w:p>
+      <w:pPr>
+        <w:spacing w:after="240" w:before="240" w:line="275.9999942779541" w:lineRule="auto"/>
+        <w:rPr>
+          <w:rFonts w:ascii="Google Sans" w:cs="Google Sans" w:eastAsia="Google Sans" w:hAnsi="Google Sans"/>
+        </w:rPr>
+      </w:pPr>
+      <w:r>
+        <w:rPr>
+          <w:rFonts w:ascii="Google Sans" w:cs="Google Sans" w:eastAsia="Google Sans" w:hAnsi="Google Sans"/>
+          <w:b w:val="1"/>
+          <w:bCs w:val="1"/>
+          <w:rtl w:val="0"/>
+        </w:rPr>
+        <w:t xml:space="preserve">Type A: Syntactic Variations &amp; String Literal Noise (Logical Success, Metric Failure)</w:t>
+      </w:r>
+      <w:r>
+        <w:rPr>
+          <w:rFonts w:ascii="Google Sans" w:cs="Google Sans" w:eastAsia="Google Sans" w:hAnsi="Google Sans"/>
+          <w:rtl w:val="0"/>
+        </w:rPr>
+        <w:t xml:space="preserve"> Many queries marked as "Failures" by the Exact Match metric were actually functionally flawless.</w:t>
+      </w:r>
+    </w:p>
+    <w:p>
+      <w:pPr>
+        <w:numPr>
+          <w:ilvl w:val="0"/>
+          <w:numId w:val="10"/>
+        </w:numPr>
+        <w:spacing w:after="0" w:afterAutospacing="0" w:before="240" w:line="275.9999942779541" w:lineRule="auto"/>
+        <w:ind w:left="720" w:hanging="360"/>
+        <w:rPr>
+          <w:rFonts w:ascii="Google Sans" w:cs="Google Sans" w:eastAsia="Google Sans" w:hAnsi="Google Sans"/>
+        </w:rPr>
+      </w:pPr>
+      <w:r>
+        <w:rPr>
+          <w:rFonts w:ascii="Google Sans" w:cs="Google Sans" w:eastAsia="Google Sans" w:hAnsi="Google Sans"/>
+          <w:i w:val="1"/>
+          <w:iCs w:val="1"/>
+          <w:rtl w:val="0"/>
+        </w:rPr>
+        <w:t xml:space="preserve">Definition:</w:t>
+      </w:r>
+      <w:r>
+        <w:rPr>
+          <w:rFonts w:ascii="Google Sans" w:cs="Google Sans" w:eastAsia="Google Sans" w:hAnsi="Google Sans"/>
+          <w:rtl w:val="0"/>
+        </w:rPr>
+        <w:t xml:space="preserve"> The model correctly identified the tables, joined them properly, and applied the right logic, but failed the strict string-comparison due to casing, alias naming (e.g., </w:t>
+      </w:r>
+      <w:r>
+        <w:rPr>
+          <w:rFonts w:ascii="Roboto Mono" w:cs="Roboto Mono" w:eastAsia="Roboto Mono" w:hAnsi="Roboto Mono"/>
+          <w:color w:val="188038"/>
+          <w:rtl w:val="0"/>
+        </w:rPr>
+        <w:t xml:space="preserve">T1</w:t>
+      </w:r>
+      <w:r>
+        <w:rPr>
+          <w:rFonts w:ascii="Google Sans" w:cs="Google Sans" w:eastAsia="Google Sans" w:hAnsi="Google Sans"/>
+          <w:rtl w:val="0"/>
+        </w:rPr>
+        <w:t xml:space="preserve"> vs </w:t>
+      </w:r>
+      <w:r>
+        <w:rPr>
+          <w:rFonts w:ascii="Roboto Mono" w:cs="Roboto Mono" w:eastAsia="Roboto Mono" w:hAnsi="Roboto Mono"/>
+          <w:color w:val="188038"/>
+          <w:rtl w:val="0"/>
+        </w:rPr>
+        <w:t xml:space="preserve">table1</w:t>
+      </w:r>
+      <w:r>
+        <w:rPr>
+          <w:rFonts w:ascii="Google Sans" w:cs="Google Sans" w:eastAsia="Google Sans" w:hAnsi="Google Sans"/>
+          <w:rtl w:val="0"/>
+        </w:rPr>
+        <w:t xml:space="preserve">), or fuzzy value extraction.</w:t>
+      </w:r>
+    </w:p>
+    <w:p>
+      <w:pPr>
+        <w:numPr>
+          <w:ilvl w:val="0"/>
+          <w:numId w:val="10"/>
+        </w:numPr>
+        <w:spacing w:after="0" w:afterAutospacing="0" w:before="0" w:beforeAutospacing="0" w:line="275.9999942779541" w:lineRule="auto"/>
+        <w:ind w:left="720" w:hanging="360"/>
+        <w:rPr>
+          <w:rFonts w:ascii="Google Sans" w:cs="Google Sans" w:eastAsia="Google Sans" w:hAnsi="Google Sans"/>
+        </w:rPr>
+      </w:pPr>
+      <w:r>
+        <w:rPr>
+          <w:rFonts w:ascii="Google Sans" w:cs="Google Sans" w:eastAsia="Google Sans" w:hAnsi="Google Sans"/>
+          <w:i w:val="1"/>
+          <w:iCs w:val="1"/>
+          <w:rtl w:val="0"/>
+        </w:rPr>
+        <w:t xml:space="preserve">Example:</w:t>
+      </w:r>
+      <w:r>
+        <w:rPr>
+          <w:rFonts w:ascii="Google Sans" w:cs="Google Sans" w:eastAsia="Google Sans" w:hAnsi="Google Sans"/>
+          <w:rtl w:val="0"/>
+        </w:rPr>
+        <w:t xml:space="preserve"> For the prompt asking about the opponent "Kansas City Chiefs", the model wrote </w:t>
+      </w:r>
+      <w:r>
+        <w:rPr>
+          <w:rFonts w:ascii="Roboto Mono" w:cs="Roboto Mono" w:eastAsia="Roboto Mono" w:hAnsi="Roboto Mono"/>
+          <w:color w:val="188038"/>
+          <w:rtl w:val="0"/>
+        </w:rPr>
+        <w:t xml:space="preserve">opponent = "kansas city chiefs"</w:t>
+      </w:r>
+      <w:r>
+        <w:rPr>
+          <w:rFonts w:ascii="Google Sans" w:cs="Google Sans" w:eastAsia="Google Sans" w:hAnsi="Google Sans"/>
+          <w:rtl w:val="0"/>
+        </w:rPr>
+        <w:t xml:space="preserve">. The Exact Match failed it because the noisy ground-truth label strictly expected </w:t>
+      </w:r>
+      <w:r>
+        <w:rPr>
+          <w:rFonts w:ascii="Roboto Mono" w:cs="Roboto Mono" w:eastAsia="Roboto Mono" w:hAnsi="Roboto Mono"/>
+          <w:color w:val="188038"/>
+          <w:rtl w:val="0"/>
+        </w:rPr>
+        <w:t xml:space="preserve">opponent = "at kansas city chiefs"</w:t>
+      </w:r>
+      <w:r>
+        <w:rPr>
+          <w:rFonts w:ascii="Google Sans" w:cs="Google Sans" w:eastAsia="Google Sans" w:hAnsi="Google Sans"/>
+          <w:rtl w:val="0"/>
+        </w:rPr>
+        <w:t xml:space="preserve">.</w:t>
+      </w:r>
+    </w:p>
+    <w:p>
+      <w:pPr>
+        <w:numPr>
+          <w:ilvl w:val="0"/>
+          <w:numId w:val="10"/>
+        </w:numPr>
+        <w:spacing w:after="240" w:before="0" w:beforeAutospacing="0" w:line="275.9999942779541" w:lineRule="auto"/>
+        <w:ind w:left="720" w:hanging="360"/>
+        <w:rPr>
+          <w:rFonts w:ascii="Google Sans" w:cs="Google Sans" w:eastAsia="Google Sans" w:hAnsi="Google Sans"/>
+        </w:rPr>
+      </w:pPr>
+      <w:r>
+        <w:rPr>
+          <w:rFonts w:ascii="Google Sans" w:cs="Google Sans" w:eastAsia="Google Sans" w:hAnsi="Google Sans"/>
+          <w:i w:val="1"/>
+          <w:iCs w:val="1"/>
+          <w:rtl w:val="0"/>
+        </w:rPr>
+        <w:t xml:space="preserve">The "Dataset is Wrong" Bug:</w:t>
+      </w:r>
+      <w:r>
+        <w:rPr>
+          <w:rFonts w:ascii="Google Sans" w:cs="Google Sans" w:eastAsia="Google Sans" w:hAnsi="Google Sans"/>
+          <w:rtl w:val="0"/>
+        </w:rPr>
+        <w:t xml:space="preserve"> In some cases, the model actually outperformed the ground-truth logic. For instance, when asked for a recent date, the model correctly used </w:t>
+      </w:r>
+      <w:r>
+        <w:rPr>
+          <w:rFonts w:ascii="Roboto Mono" w:cs="Roboto Mono" w:eastAsia="Roboto Mono" w:hAnsi="Roboto Mono"/>
+          <w:color w:val="188038"/>
+          <w:rtl w:val="0"/>
+        </w:rPr>
+        <w:t xml:space="preserve">MAX(date)</w:t>
+      </w:r>
+      <w:r>
+        <w:rPr>
+          <w:rFonts w:ascii="Google Sans" w:cs="Google Sans" w:eastAsia="Google Sans" w:hAnsi="Google Sans"/>
+          <w:rtl w:val="0"/>
+        </w:rPr>
+        <w:t xml:space="preserve">, but was marked wrong because the ground truth inexplicably used </w:t>
+      </w:r>
+      <w:r>
+        <w:rPr>
+          <w:rFonts w:ascii="Roboto Mono" w:cs="Roboto Mono" w:eastAsia="Roboto Mono" w:hAnsi="Roboto Mono"/>
+          <w:color w:val="188038"/>
+          <w:rtl w:val="0"/>
+        </w:rPr>
+        <w:t xml:space="preserve">SUM(date)</w:t>
+      </w:r>
+      <w:r>
+        <w:rPr>
+          <w:rFonts w:ascii="Google Sans" w:cs="Google Sans" w:eastAsia="Google Sans" w:hAnsi="Google Sans"/>
+          <w:rtl w:val="0"/>
+        </w:rPr>
+        <w:t xml:space="preserve">—an objectively nonsensical SQL operation. Type A failures prove the 7B model developed a strong, generalized "SQL Intuition".</w:t>
+        <w:br w:type="textWrapping"/>
+        <w:t xml:space="preserve">+1</w:t>
+      </w:r>
+    </w:p>
+    <w:p>
+      <w:pPr>
+        <w:spacing w:after="240" w:before="240" w:line="275.9999942779541" w:lineRule="auto"/>
+        <w:rPr>
+          <w:rFonts w:ascii="Google Sans" w:cs="Google Sans" w:eastAsia="Google Sans" w:hAnsi="Google Sans"/>
+        </w:rPr>
+      </w:pPr>
+      <w:r>
+        <w:rPr>
+          <w:rFonts w:ascii="Google Sans" w:cs="Google Sans" w:eastAsia="Google Sans" w:hAnsi="Google Sans"/>
+          <w:b w:val="1"/>
+          <w:bCs w:val="1"/>
+          <w:rtl w:val="0"/>
+        </w:rPr>
+        <w:t xml:space="preserve">Type B: Over-Inference &amp; Instructional Hallucination (True Failure)</w:t>
+      </w:r>
+      <w:r>
+        <w:rPr>
+          <w:rFonts w:ascii="Google Sans" w:cs="Google Sans" w:eastAsia="Google Sans" w:hAnsi="Google Sans"/>
+          <w:rtl w:val="0"/>
+        </w:rPr>
+        <w:t xml:space="preserve"> This was the most prominent true failure mode, exposing a vulnerability in the fine-tuning process.</w:t>
+      </w:r>
+    </w:p>
+    <w:p>
+      <w:pPr>
+        <w:numPr>
+          <w:ilvl w:val="0"/>
+          <w:numId w:val="1"/>
+        </w:numPr>
+        <w:spacing w:after="0" w:afterAutospacing="0" w:before="240" w:line="275.9999942779541" w:lineRule="auto"/>
+        <w:ind w:left="720" w:hanging="360"/>
+        <w:rPr>
+          <w:rFonts w:ascii="Google Sans" w:cs="Google Sans" w:eastAsia="Google Sans" w:hAnsi="Google Sans"/>
+        </w:rPr>
+      </w:pPr>
+      <w:r>
+        <w:rPr>
+          <w:rFonts w:ascii="Google Sans" w:cs="Google Sans" w:eastAsia="Google Sans" w:hAnsi="Google Sans"/>
+          <w:i w:val="1"/>
+          <w:iCs w:val="1"/>
+          <w:rtl w:val="0"/>
+        </w:rPr>
+        <w:t xml:space="preserve">Definition:</w:t>
+      </w:r>
+      <w:r>
+        <w:rPr>
+          <w:rFonts w:ascii="Google Sans" w:cs="Google Sans" w:eastAsia="Google Sans" w:hAnsi="Google Sans"/>
+          <w:rtl w:val="0"/>
+        </w:rPr>
+        <w:t xml:space="preserve"> The model became highly SQL-literate and Schema-Aware, but suffered from "Instructional Hallucination". When fed a massive schema, it eagerly assumed that </w:t>
+      </w:r>
+      <w:r>
+        <w:rPr>
+          <w:rFonts w:ascii="Google Sans" w:cs="Google Sans" w:eastAsia="Google Sans" w:hAnsi="Google Sans"/>
+          <w:i w:val="1"/>
+          <w:iCs w:val="1"/>
+          <w:rtl w:val="0"/>
+        </w:rPr>
+        <w:t xml:space="preserve">every</w:t>
+      </w:r>
+      <w:r>
+        <w:rPr>
+          <w:rFonts w:ascii="Google Sans" w:cs="Google Sans" w:eastAsia="Google Sans" w:hAnsi="Google Sans"/>
+          <w:rtl w:val="0"/>
+        </w:rPr>
+        <w:t xml:space="preserve"> column provided in the DDL was a constraint that needed to be used.</w:t>
+      </w:r>
+    </w:p>
+    <w:p>
+      <w:pPr>
+        <w:numPr>
+          <w:ilvl w:val="0"/>
+          <w:numId w:val="1"/>
+        </w:numPr>
+        <w:spacing w:after="0" w:afterAutospacing="0" w:before="0" w:beforeAutospacing="0" w:line="275.9999942779541" w:lineRule="auto"/>
+        <w:ind w:left="720" w:hanging="360"/>
+        <w:rPr>
+          <w:rFonts w:ascii="Google Sans" w:cs="Google Sans" w:eastAsia="Google Sans" w:hAnsi="Google Sans"/>
+        </w:rPr>
+      </w:pPr>
+      <w:r>
+        <w:rPr>
+          <w:rFonts w:ascii="Google Sans" w:cs="Google Sans" w:eastAsia="Google Sans" w:hAnsi="Google Sans"/>
+          <w:i w:val="1"/>
+          <w:iCs w:val="1"/>
+          <w:rtl w:val="0"/>
+        </w:rPr>
+        <w:t xml:space="preserve">The Cause:</w:t>
+      </w:r>
+      <w:r>
+        <w:rPr>
+          <w:rFonts w:ascii="Google Sans" w:cs="Google Sans" w:eastAsia="Google Sans" w:hAnsi="Google Sans"/>
+          <w:rtl w:val="0"/>
+        </w:rPr>
+        <w:t xml:space="preserve"> The model over-fitted to the training data. It lacked "instruction following robustness," meaning it ignored the system prompt telling it to </w:t>
+      </w:r>
+      <w:r>
+        <w:rPr>
+          <w:rFonts w:ascii="Google Sans" w:cs="Google Sans" w:eastAsia="Google Sans" w:hAnsi="Google Sans"/>
+          <w:i w:val="1"/>
+          <w:iCs w:val="1"/>
+          <w:rtl w:val="0"/>
+        </w:rPr>
+        <w:t xml:space="preserve">only</w:t>
+      </w:r>
+      <w:r>
+        <w:rPr>
+          <w:rFonts w:ascii="Google Sans" w:cs="Google Sans" w:eastAsia="Google Sans" w:hAnsi="Google Sans"/>
+          <w:rtl w:val="0"/>
+        </w:rPr>
+        <w:t xml:space="preserve"> use requested columns, and instead added unnecessary </w:t>
+      </w:r>
+      <w:r>
+        <w:rPr>
+          <w:rFonts w:ascii="Roboto Mono" w:cs="Roboto Mono" w:eastAsia="Roboto Mono" w:hAnsi="Roboto Mono"/>
+          <w:color w:val="188038"/>
+          <w:rtl w:val="0"/>
+        </w:rPr>
+        <w:t xml:space="preserve">WHERE</w:t>
+      </w:r>
+      <w:r>
+        <w:rPr>
+          <w:rFonts w:ascii="Google Sans" w:cs="Google Sans" w:eastAsia="Google Sans" w:hAnsi="Google Sans"/>
+          <w:rtl w:val="0"/>
+        </w:rPr>
+        <w:t xml:space="preserve"> filters or </w:t>
+      </w:r>
+      <w:r>
+        <w:rPr>
+          <w:rFonts w:ascii="Roboto Mono" w:cs="Roboto Mono" w:eastAsia="Roboto Mono" w:hAnsi="Roboto Mono"/>
+          <w:color w:val="188038"/>
+          <w:rtl w:val="0"/>
+        </w:rPr>
+        <w:t xml:space="preserve">JOIN</w:t>
+      </w:r>
+      <w:r>
+        <w:rPr>
+          <w:rFonts w:ascii="Google Sans" w:cs="Google Sans" w:eastAsia="Google Sans" w:hAnsi="Google Sans"/>
+          <w:rtl w:val="0"/>
+        </w:rPr>
+        <w:t xml:space="preserve">s just to be "complete".</w:t>
+      </w:r>
+    </w:p>
+    <w:p>
+      <w:pPr>
+        <w:numPr>
+          <w:ilvl w:val="0"/>
+          <w:numId w:val="1"/>
+        </w:numPr>
+        <w:spacing w:after="240" w:before="0" w:beforeAutospacing="0" w:line="275.9999942779541" w:lineRule="auto"/>
+        <w:ind w:left="720" w:hanging="360"/>
+        <w:rPr>
+          <w:rFonts w:ascii="Google Sans" w:cs="Google Sans" w:eastAsia="Google Sans" w:hAnsi="Google Sans"/>
+        </w:rPr>
+      </w:pPr>
+      <w:r>
+        <w:rPr>
+          <w:rFonts w:ascii="Google Sans" w:cs="Google Sans" w:eastAsia="Google Sans" w:hAnsi="Google Sans"/>
+          <w:i w:val="1"/>
+          <w:iCs w:val="1"/>
+          <w:rtl w:val="0"/>
+        </w:rPr>
+        <w:t xml:space="preserve">The Fix:</w:t>
+      </w:r>
+      <w:r>
+        <w:rPr>
+          <w:rFonts w:ascii="Google Sans" w:cs="Google Sans" w:eastAsia="Google Sans" w:hAnsi="Google Sans"/>
+          <w:rtl w:val="0"/>
+        </w:rPr>
+        <w:t xml:space="preserve"> We mitigated this by injecting "Distractor Schemas" (negative sampling) into the prompt during training, forcing the model to realize that 80% of the provided context is usually irrelevant and must be ignored.</w:t>
+      </w:r>
+    </w:p>
+    <w:p>
+      <w:pPr>
+        <w:spacing w:after="240" w:before="240" w:line="275.9999942779541" w:lineRule="auto"/>
+        <w:rPr>
+          <w:rFonts w:ascii="Google Sans" w:cs="Google Sans" w:eastAsia="Google Sans" w:hAnsi="Google Sans"/>
+          <w:b w:val="1"/>
+          <w:bCs w:val="1"/>
+        </w:rPr>
+      </w:pPr>
+      <w:r>
+        <w:rPr>
+          <w:rFonts w:ascii="Google Sans" w:cs="Google Sans" w:eastAsia="Google Sans" w:hAnsi="Google Sans"/>
+          <w:b w:val="1"/>
+          <w:bCs w:val="1"/>
+          <w:rtl w:val="0"/>
+        </w:rPr>
+        <w:t xml:space="preserve">Type C: Exact Match (True Success)</w:t>
+      </w:r>
+    </w:p>
+    <w:p>
+      <w:pPr>
+        <w:numPr>
+          <w:ilvl w:val="0"/>
+          <w:numId w:val="9"/>
+        </w:numPr>
+        <w:spacing w:after="240" w:before="240" w:line="275.9999942779541" w:lineRule="auto"/>
+        <w:ind w:left="720" w:hanging="360"/>
+        <w:rPr>
+          <w:rFonts w:ascii="Google Sans" w:cs="Google Sans" w:eastAsia="Google Sans" w:hAnsi="Google Sans"/>
+        </w:rPr>
+      </w:pPr>
+      <w:r>
+        <w:rPr>
+          <w:rFonts w:ascii="Google Sans" w:cs="Google Sans" w:eastAsia="Google Sans" w:hAnsi="Google Sans"/>
+          <w:i w:val="1"/>
+          <w:iCs w:val="1"/>
+          <w:rtl w:val="0"/>
+        </w:rPr>
+        <w:t xml:space="preserve">Definition:</w:t>
+      </w:r>
+      <w:r>
+        <w:rPr>
+          <w:rFonts w:ascii="Google Sans" w:cs="Google Sans" w:eastAsia="Google Sans" w:hAnsi="Google Sans"/>
+          <w:rtl w:val="0"/>
+        </w:rPr>
+        <w:t xml:space="preserve"> The model perfectly navigated the schema, extracted only the necessary entities, ignored the distractors, and outputted a SQL string that byte-for-byte matched the ground truth.</w:t>
+      </w:r>
+    </w:p>
+    <w:p>
+      <w:pPr>
         <w:pBdr>
           <w:top w:space="0" w:sz="0" w:val="nil"/>
           <w:left w:space="0" w:sz="0" w:val="nil"/>
@@ -1239,136 +1917,7 @@
         </w:pBdr>
         <w:shd w:fill="auto" w:val="clear"/>
         <w:spacing w:line="275.9999942779541" w:lineRule="auto"/>
-        <w:rPr>
-          <w:rFonts w:ascii="Google Sans" w:cs="Google Sans" w:eastAsia="Google Sans" w:hAnsi="Google Sans"/>
-        </w:rPr>
-      </w:pPr>
-      <w:r>
-        <w:rPr>
-          <w:rFonts w:ascii="Google Sans" w:cs="Google Sans" w:eastAsia="Google Sans" w:hAnsi="Google Sans"/>
-          <w:rtl w:val="0"/>
-        </w:rPr>
-        <w:t xml:space="preserve">We utilized </w:t>
-      </w:r>
-      <w:r>
-        <w:rPr>
-          <w:rFonts w:ascii="Google Sans" w:cs="Google Sans" w:eastAsia="Google Sans" w:hAnsi="Google Sans"/>
-          <w:b w:val="1"/>
-          <w:bCs w:val="1"/>
-          <w:rtl w:val="0"/>
-        </w:rPr>
-        <w:t xml:space="preserve">Exact Match (EM)</w:t>
-      </w:r>
-      <w:r>
-        <w:rPr>
-          <w:rFonts w:ascii="Google Sans" w:cs="Google Sans" w:eastAsia="Google Sans" w:hAnsi="Google Sans"/>
-          <w:rtl w:val="0"/>
-        </w:rPr>
-        <w:t xml:space="preserve"> and </w:t>
-      </w:r>
-      <w:r>
-        <w:rPr>
-          <w:rFonts w:ascii="Google Sans" w:cs="Google Sans" w:eastAsia="Google Sans" w:hAnsi="Google Sans"/>
-          <w:b w:val="1"/>
-          <w:bCs w:val="1"/>
-          <w:rtl w:val="0"/>
-        </w:rPr>
-        <w:t xml:space="preserve">Proximal Match (Jaccard Token Similarity)</w:t>
-      </w:r>
-      <w:r>
-        <w:rPr>
-          <w:rFonts w:ascii="Google Sans" w:cs="Google Sans" w:eastAsia="Google Sans" w:hAnsi="Google Sans"/>
-          <w:rtl w:val="0"/>
-        </w:rPr>
-        <w:t xml:space="preserve"> for evaluation.</w:t>
-      </w:r>
-    </w:p>
-    <w:p>
-      <w:pPr>
-        <w:pBdr>
-          <w:top w:space="0" w:sz="0" w:val="nil"/>
-          <w:left w:space="0" w:sz="0" w:val="nil"/>
-          <w:bottom w:space="0" w:sz="0" w:val="nil"/>
-          <w:right w:space="0" w:sz="0" w:val="nil"/>
-          <w:between w:space="0" w:sz="0" w:val="nil"/>
-        </w:pBdr>
-        <w:shd w:fill="auto" w:val="clear"/>
-        <w:rPr>
-          <w:rFonts w:ascii="Google Sans" w:cs="Google Sans" w:eastAsia="Google Sans" w:hAnsi="Google Sans"/>
-        </w:rPr>
-      </w:pPr>
-      <w:r>
-        <w:rPr>
-          <w:rtl w:val="0"/>
-        </w:rPr>
-      </w:r>
-    </w:p>
-    <w:p>
-      <w:pPr>
-        <w:numPr>
-          <w:ilvl w:val="0"/>
-          <w:numId w:val="6"/>
-        </w:numPr>
-        <w:pBdr>
-          <w:top w:space="0" w:sz="0" w:val="nil"/>
-          <w:left w:space="0" w:sz="0" w:val="nil"/>
-          <w:bottom w:space="0" w:sz="0" w:val="nil"/>
-          <w:right w:space="0" w:sz="0" w:val="nil"/>
-          <w:between w:space="0" w:sz="0" w:val="nil"/>
-        </w:pBdr>
-        <w:shd w:fill="auto" w:val="clear"/>
-        <w:spacing w:line="275.9999942779541" w:lineRule="auto"/>
-        <w:ind w:left="600" w:hanging="360"/>
-      </w:pPr>
-      <w:r>
-        <w:rPr>
-          <w:rFonts w:ascii="Google Sans" w:cs="Google Sans" w:eastAsia="Google Sans" w:hAnsi="Google Sans"/>
-          <w:b w:val="1"/>
-          <w:bCs w:val="1"/>
-          <w:rtl w:val="0"/>
-        </w:rPr>
-        <w:t xml:space="preserve">CodeT5+ Results:</w:t>
-      </w:r>
-      <w:r>
-        <w:rPr>
-          <w:rFonts w:ascii="Google Sans" w:cs="Google Sans" w:eastAsia="Google Sans" w:hAnsi="Google Sans"/>
-          <w:rtl w:val="0"/>
-        </w:rPr>
-        <w:t xml:space="preserve"> Achieved </w:t>
-      </w:r>
-      <w:r>
-        <w:rPr>
-          <w:rFonts w:ascii="Google Sans" w:cs="Google Sans" w:eastAsia="Google Sans" w:hAnsi="Google Sans"/>
-          <w:b w:val="1"/>
-          <w:bCs w:val="1"/>
-          <w:rtl w:val="0"/>
-        </w:rPr>
-        <w:t xml:space="preserve">75.00% Exact Match</w:t>
-      </w:r>
-      <w:r>
-        <w:rPr>
-          <w:rFonts w:ascii="Google Sans" w:cs="Google Sans" w:eastAsia="Google Sans" w:hAnsi="Google Sans"/>
-          <w:rtl w:val="0"/>
-        </w:rPr>
-        <w:t xml:space="preserve"> on in-distribution data, but a brutal </w:t>
-      </w:r>
-      <w:r>
-        <w:rPr>
-          <w:rFonts w:ascii="Google Sans" w:cs="Google Sans" w:eastAsia="Google Sans" w:hAnsi="Google Sans"/>
-          <w:b w:val="1"/>
-          <w:bCs w:val="1"/>
-          <w:rtl w:val="0"/>
-        </w:rPr>
-        <w:t xml:space="preserve">0.00%</w:t>
-      </w:r>
-      <w:r>
-        <w:rPr>
-          <w:rFonts w:ascii="Google Sans" w:cs="Google Sans" w:eastAsia="Google Sans" w:hAnsi="Google Sans"/>
-          <w:rtl w:val="0"/>
-        </w:rPr>
-        <w:t xml:space="preserve"> on Out-of-Distribution datasets like WikiSQL. The model entirely collapsed under Domain Shift, proving it was overfitting to task structure rather than learning SQL logic.</w:t>
-      </w:r>
-      <w:r>
+        <w:ind w:left="0" w:firstLine="0"/>
         <w:rPr>
           <w:rFonts w:ascii="Arial" w:cs="Arial" w:eastAsia="Arial" w:hAnsi="Arial"/>
           <w:b w:val="0"/>
@@ -1383,16 +1932,82 @@
           <w:u w:val="none"/>
           <w:shd w:fill="auto" w:val="clear"/>
           <w:vertAlign w:val="baseline"/>
-          <w:rtl w:val="0"/>
-        </w:rPr>
-        <w:br w:type="textWrapping"/>
+        </w:rPr>
+      </w:pPr>
+      <w:r>
+        <w:rPr>
+          <w:rtl w:val="0"/>
+        </w:rPr>
+      </w:r>
+    </w:p>
+    <w:p>
+      <w:pPr>
+        <w:pStyle w:val="Heading3"/>
+        <w:pBdr>
+          <w:top w:space="0" w:sz="0" w:val="nil"/>
+          <w:left w:space="0" w:sz="0" w:val="nil"/>
+          <w:bottom w:space="0" w:sz="0" w:val="nil"/>
+          <w:right w:space="0" w:sz="0" w:val="nil"/>
+          <w:between w:space="0" w:sz="0" w:val="nil"/>
+        </w:pBdr>
+        <w:shd w:fill="auto" w:val="clear"/>
+        <w:spacing w:before="0" w:line="275.9999942779541" w:lineRule="auto"/>
+        <w:rPr>
+          <w:rFonts w:ascii="Google Sans" w:cs="Google Sans" w:eastAsia="Google Sans" w:hAnsi="Google Sans"/>
+          <w:b w:val="1"/>
+          <w:bCs w:val="1"/>
+          <w:i w:val="0"/>
+          <w:iCs w:val="0"/>
+          <w:sz w:val="28"/>
+          <w:szCs w:val="28"/>
+        </w:rPr>
+      </w:pPr>
+      <w:r>
+        <w:rPr>
+          <w:rFonts w:ascii="Google Sans" w:cs="Google Sans" w:eastAsia="Google Sans" w:hAnsi="Google Sans"/>
+          <w:b w:val="1"/>
+          <w:bCs w:val="1"/>
+          <w:i w:val="0"/>
+          <w:iCs w:val="0"/>
+          <w:sz w:val="28"/>
+          <w:szCs w:val="28"/>
+          <w:rtl w:val="0"/>
+        </w:rPr>
+        <w:t xml:space="preserve">g) Improvements &amp; Reasoning</w:t>
+      </w:r>
+    </w:p>
+    <w:p>
+      <w:pPr>
+        <w:pBdr>
+          <w:top w:space="0" w:sz="0" w:val="nil"/>
+          <w:left w:space="0" w:sz="0" w:val="nil"/>
+          <w:bottom w:space="0" w:sz="0" w:val="nil"/>
+          <w:right w:space="0" w:sz="0" w:val="nil"/>
+          <w:between w:space="0" w:sz="0" w:val="nil"/>
+        </w:pBdr>
+        <w:shd w:fill="auto" w:val="clear"/>
+        <w:spacing w:line="275.9999942779541" w:lineRule="auto"/>
+        <w:rPr>
+          <w:rFonts w:ascii="Google Sans" w:cs="Google Sans" w:eastAsia="Google Sans" w:hAnsi="Google Sans"/>
+          <w:b w:val="1"/>
+          <w:bCs w:val="1"/>
+        </w:rPr>
+      </w:pPr>
+      <w:r>
+        <w:rPr>
+          <w:rFonts w:ascii="Google Sans" w:cs="Google Sans" w:eastAsia="Google Sans" w:hAnsi="Google Sans"/>
+          <w:b w:val="1"/>
+          <w:bCs w:val="1"/>
+          <w:rtl w:val="0"/>
+        </w:rPr>
+        <w:t xml:space="preserve">1. Move from Exact Match to Execution Accuracy (EX):</w:t>
       </w:r>
     </w:p>
     <w:p>
       <w:pPr>
         <w:numPr>
           <w:ilvl w:val="0"/>
-          <w:numId w:val="6"/>
+          <w:numId w:val="8"/>
         </w:numPr>
         <w:pBdr>
           <w:top w:space="0" w:sz="0" w:val="nil"/>
@@ -1408,45 +2023,18 @@
       <w:r>
         <w:rPr>
           <w:rFonts w:ascii="Google Sans" w:cs="Google Sans" w:eastAsia="Google Sans" w:hAnsi="Google Sans"/>
-          <w:b w:val="1"/>
-          <w:bCs w:val="1"/>
-          <w:rtl w:val="0"/>
-        </w:rPr>
-        <w:t xml:space="preserve">CodeQwen 7B Results:</w:t>
-      </w:r>
-      <w:r>
-        <w:rPr>
-          <w:rFonts w:ascii="Google Sans" w:cs="Google Sans" w:eastAsia="Google Sans" w:hAnsi="Google Sans"/>
-          <w:rtl w:val="0"/>
-        </w:rPr>
-        <w:t xml:space="preserve"> After implementing DDL-aware inference and negative sampling, the 7B model broke the zero-shot barrier. On the highly complex Spider evaluation set, it achieved:</w:t>
-      </w:r>
-    </w:p>
-    <w:p>
-      <w:pPr>
-        <w:numPr>
-          <w:ilvl w:val="1"/>
-          <w:numId w:val="7"/>
-        </w:numPr>
-        <w:pBdr>
-          <w:top w:space="0" w:sz="0" w:val="nil"/>
-          <w:left w:space="0" w:sz="0" w:val="nil"/>
-          <w:bottom w:space="0" w:sz="0" w:val="nil"/>
-          <w:right w:space="0" w:sz="0" w:val="nil"/>
-          <w:between w:space="0" w:sz="0" w:val="nil"/>
-        </w:pBdr>
-        <w:shd w:fill="auto" w:val="clear"/>
-        <w:spacing w:line="275.9999942779541" w:lineRule="auto"/>
-        <w:ind w:left="1200" w:hanging="360"/>
-      </w:pPr>
-      <w:r>
-        <w:rPr>
-          <w:rFonts w:ascii="Google Sans" w:cs="Google Sans" w:eastAsia="Google Sans" w:hAnsi="Google Sans"/>
-          <w:b w:val="1"/>
-          <w:bCs w:val="1"/>
-          <w:rtl w:val="0"/>
-        </w:rPr>
-        <w:t xml:space="preserve">Exact Match (EM): 12.00%</w:t>
+          <w:i w:val="1"/>
+          <w:iCs w:val="1"/>
+          <w:rtl w:val="0"/>
+        </w:rPr>
+        <w:t xml:space="preserve">Why:</w:t>
+      </w:r>
+      <w:r>
+        <w:rPr>
+          <w:rFonts w:ascii="Google Sans" w:cs="Google Sans" w:eastAsia="Google Sans" w:hAnsi="Google Sans"/>
+          <w:rtl w:val="0"/>
+        </w:rPr>
+        <w:t xml:space="preserve"> Exact string matching is a flawed metric for SQL. SELECT name FROM users and SELECT users.name FROM users are functionally identical but fail an EM check. Building a lightweight SQLite execution sandbox to compare resulting dataframes would massively inflate the true accuracy score.</w:t>
       </w:r>
       <w:r>
         <w:rPr>
@@ -1466,239 +2054,6 @@
           <w:rtl w:val="0"/>
         </w:rPr>
         <w:br w:type="textWrapping"/>
-        <w:br w:type="textWrapping"/>
-      </w:r>
-    </w:p>
-    <w:p>
-      <w:pPr>
-        <w:numPr>
-          <w:ilvl w:val="1"/>
-          <w:numId w:val="7"/>
-        </w:numPr>
-        <w:pBdr>
-          <w:top w:space="0" w:sz="0" w:val="nil"/>
-          <w:left w:space="0" w:sz="0" w:val="nil"/>
-          <w:bottom w:space="0" w:sz="0" w:val="nil"/>
-          <w:right w:space="0" w:sz="0" w:val="nil"/>
-          <w:between w:space="0" w:sz="0" w:val="nil"/>
-        </w:pBdr>
-        <w:shd w:fill="auto" w:val="clear"/>
-        <w:spacing w:line="275.9999942779541" w:lineRule="auto"/>
-        <w:ind w:left="1200" w:hanging="360"/>
-      </w:pPr>
-      <w:r>
-        <w:rPr>
-          <w:rFonts w:ascii="Google Sans" w:cs="Google Sans" w:eastAsia="Google Sans" w:hAnsi="Google Sans"/>
-          <w:b w:val="1"/>
-          <w:bCs w:val="1"/>
-          <w:rtl w:val="0"/>
-        </w:rPr>
-        <w:t xml:space="preserve">Proximal Match: 50.89%</w:t>
-      </w:r>
-      <w:r>
-        <w:rPr>
-          <w:rFonts w:ascii="Arial" w:cs="Arial" w:eastAsia="Arial" w:hAnsi="Arial"/>
-          <w:b w:val="0"/>
-          <w:bCs w:val="0"/>
-          <w:i w:val="0"/>
-          <w:iCs w:val="0"/>
-          <w:smallCaps w:val="0"/>
-          <w:strike w:val="0"/>
-          <w:color w:val="000000"/>
-          <w:sz w:val="22"/>
-          <w:szCs w:val="22"/>
-          <w:u w:val="none"/>
-          <w:shd w:fill="auto" w:val="clear"/>
-          <w:vertAlign w:val="baseline"/>
-          <w:rtl w:val="0"/>
-        </w:rPr>
-        <w:br w:type="textWrapping"/>
-        <w:br w:type="textWrapping"/>
-      </w:r>
-    </w:p>
-    <w:p>
-      <w:pPr>
-        <w:numPr>
-          <w:ilvl w:val="0"/>
-          <w:numId w:val="6"/>
-        </w:numPr>
-        <w:pBdr>
-          <w:top w:space="0" w:sz="0" w:val="nil"/>
-          <w:left w:space="0" w:sz="0" w:val="nil"/>
-          <w:bottom w:space="0" w:sz="0" w:val="nil"/>
-          <w:right w:space="0" w:sz="0" w:val="nil"/>
-          <w:between w:space="0" w:sz="0" w:val="nil"/>
-        </w:pBdr>
-        <w:shd w:fill="auto" w:val="clear"/>
-        <w:spacing w:line="275.9999942779541" w:lineRule="auto"/>
-        <w:ind w:left="600" w:hanging="360"/>
-      </w:pPr>
-      <w:r>
-        <w:rPr>
-          <w:rFonts w:ascii="Google Sans" w:cs="Google Sans" w:eastAsia="Google Sans" w:hAnsi="Google Sans"/>
-          <w:b w:val="1"/>
-          <w:bCs w:val="1"/>
-          <w:rtl w:val="0"/>
-        </w:rPr>
-        <w:t xml:space="preserve">Failure Analysis of CodeQwen:</w:t>
-      </w:r>
-      <w:r>
-        <w:rPr>
-          <w:rFonts w:ascii="Google Sans" w:cs="Google Sans" w:eastAsia="Google Sans" w:hAnsi="Google Sans"/>
-          <w:rtl w:val="0"/>
-        </w:rPr>
-        <w:t xml:space="preserve"> The 88% EM failure is highly deceptive. Qualitative analysis revealed that many "failures" were </w:t>
-      </w:r>
-      <w:r>
-        <w:rPr>
-          <w:rFonts w:ascii="Google Sans" w:cs="Google Sans" w:eastAsia="Google Sans" w:hAnsi="Google Sans"/>
-          <w:i w:val="1"/>
-          <w:iCs w:val="1"/>
-          <w:rtl w:val="0"/>
-        </w:rPr>
-        <w:t xml:space="preserve">Type A (Syntactic Variations)</w:t>
-      </w:r>
-      <w:r>
-        <w:rPr>
-          <w:rFonts w:ascii="Google Sans" w:cs="Google Sans" w:eastAsia="Google Sans" w:hAnsi="Google Sans"/>
-          <w:rtl w:val="0"/>
-        </w:rPr>
-        <w:t xml:space="preserve">, where the model outputted functionally correct SQL that didn't string-match the ground truth (e.g., using max(date) vs an objectively incorrect ground-truth label like sum(date)).</w:t>
-      </w:r>
-      <w:r>
-        <w:rPr>
-          <w:rFonts w:ascii="Arial" w:cs="Arial" w:eastAsia="Arial" w:hAnsi="Arial"/>
-          <w:b w:val="0"/>
-          <w:bCs w:val="0"/>
-          <w:i w:val="0"/>
-          <w:iCs w:val="0"/>
-          <w:smallCaps w:val="0"/>
-          <w:strike w:val="0"/>
-          <w:color w:val="000000"/>
-          <w:sz w:val="22"/>
-          <w:szCs w:val="22"/>
-          <w:u w:val="none"/>
-          <w:shd w:fill="auto" w:val="clear"/>
-          <w:vertAlign w:val="baseline"/>
-          <w:rtl w:val="0"/>
-        </w:rPr>
-        <w:br w:type="textWrapping"/>
-      </w:r>
-    </w:p>
-    <w:p>
-      <w:pPr>
-        <w:pStyle w:val="Heading3"/>
-        <w:pBdr>
-          <w:top w:space="0" w:sz="0" w:val="nil"/>
-          <w:left w:space="0" w:sz="0" w:val="nil"/>
-          <w:bottom w:space="0" w:sz="0" w:val="nil"/>
-          <w:right w:space="0" w:sz="0" w:val="nil"/>
-          <w:between w:space="0" w:sz="0" w:val="nil"/>
-        </w:pBdr>
-        <w:shd w:fill="auto" w:val="clear"/>
-        <w:spacing w:before="0" w:line="275.9999942779541" w:lineRule="auto"/>
-        <w:rPr>
-          <w:rFonts w:ascii="Google Sans" w:cs="Google Sans" w:eastAsia="Google Sans" w:hAnsi="Google Sans"/>
-          <w:b w:val="1"/>
-          <w:bCs w:val="1"/>
-          <w:i w:val="0"/>
-          <w:iCs w:val="0"/>
-          <w:sz w:val="28"/>
-          <w:szCs w:val="28"/>
-        </w:rPr>
-      </w:pPr>
-      <w:r>
-        <w:rPr>
-          <w:rFonts w:ascii="Google Sans" w:cs="Google Sans" w:eastAsia="Google Sans" w:hAnsi="Google Sans"/>
-          <w:b w:val="1"/>
-          <w:bCs w:val="1"/>
-          <w:i w:val="0"/>
-          <w:iCs w:val="0"/>
-          <w:sz w:val="28"/>
-          <w:szCs w:val="28"/>
-          <w:rtl w:val="0"/>
-        </w:rPr>
-        <w:t xml:space="preserve">g) Improvements &amp; Reasoning</w:t>
-      </w:r>
-    </w:p>
-    <w:p>
-      <w:pPr>
-        <w:pBdr>
-          <w:top w:space="0" w:sz="0" w:val="nil"/>
-          <w:left w:space="0" w:sz="0" w:val="nil"/>
-          <w:bottom w:space="0" w:sz="0" w:val="nil"/>
-          <w:right w:space="0" w:sz="0" w:val="nil"/>
-          <w:between w:space="0" w:sz="0" w:val="nil"/>
-        </w:pBdr>
-        <w:shd w:fill="auto" w:val="clear"/>
-        <w:spacing w:line="275.9999942779541" w:lineRule="auto"/>
-        <w:rPr>
-          <w:rFonts w:ascii="Google Sans" w:cs="Google Sans" w:eastAsia="Google Sans" w:hAnsi="Google Sans"/>
-          <w:b w:val="1"/>
-          <w:bCs w:val="1"/>
-        </w:rPr>
-      </w:pPr>
-      <w:r>
-        <w:rPr>
-          <w:rFonts w:ascii="Google Sans" w:cs="Google Sans" w:eastAsia="Google Sans" w:hAnsi="Google Sans"/>
-          <w:b w:val="1"/>
-          <w:bCs w:val="1"/>
-          <w:rtl w:val="0"/>
-        </w:rPr>
-        <w:t xml:space="preserve">1. Move from Exact Match to Execution Accuracy (EX):</w:t>
-      </w:r>
-    </w:p>
-    <w:p>
-      <w:pPr>
-        <w:numPr>
-          <w:ilvl w:val="0"/>
-          <w:numId w:val="8"/>
-        </w:numPr>
-        <w:pBdr>
-          <w:top w:space="0" w:sz="0" w:val="nil"/>
-          <w:left w:space="0" w:sz="0" w:val="nil"/>
-          <w:bottom w:space="0" w:sz="0" w:val="nil"/>
-          <w:right w:space="0" w:sz="0" w:val="nil"/>
-          <w:between w:space="0" w:sz="0" w:val="nil"/>
-        </w:pBdr>
-        <w:shd w:fill="auto" w:val="clear"/>
-        <w:spacing w:line="275.9999942779541" w:lineRule="auto"/>
-        <w:ind w:left="600" w:hanging="360"/>
-      </w:pPr>
-      <w:r>
-        <w:rPr>
-          <w:rFonts w:ascii="Google Sans" w:cs="Google Sans" w:eastAsia="Google Sans" w:hAnsi="Google Sans"/>
-          <w:i w:val="1"/>
-          <w:iCs w:val="1"/>
-          <w:rtl w:val="0"/>
-        </w:rPr>
-        <w:t xml:space="preserve">Why:</w:t>
-      </w:r>
-      <w:r>
-        <w:rPr>
-          <w:rFonts w:ascii="Google Sans" w:cs="Google Sans" w:eastAsia="Google Sans" w:hAnsi="Google Sans"/>
-          <w:rtl w:val="0"/>
-        </w:rPr>
-        <w:t xml:space="preserve"> Exact string matching is a flawed metric for SQL. SELECT name FROM users and SELECT users.name FROM users are functionally identical but fail an EM check. Building a lightweight SQLite execution sandbox to compare resulting dataframes would massively inflate the true accuracy score.</w:t>
-      </w:r>
-      <w:r>
-        <w:rPr>
-          <w:rFonts w:ascii="Arial" w:cs="Arial" w:eastAsia="Arial" w:hAnsi="Arial"/>
-          <w:b w:val="0"/>
-          <w:bCs w:val="0"/>
-          <w:i w:val="0"/>
-          <w:iCs w:val="0"/>
-          <w:smallCaps w:val="0"/>
-          <w:strike w:val="0"/>
-          <w:color w:val="000000"/>
-          <w:sz w:val="22"/>
-          <w:szCs w:val="22"/>
-          <w:u w:val="none"/>
-          <w:shd w:fill="auto" w:val="clear"/>
-          <w:vertAlign w:val="baseline"/>
-          <w:rtl w:val="0"/>
-        </w:rPr>
-        <w:br w:type="textWrapping"/>
       </w:r>
       <w:r>
         <w:rPr>
@@ -1778,22 +2133,10 @@
       <w:lvlText w:val="●"/>
       <w:lvlJc w:val="left"/>
       <w:pPr>
-        <w:ind w:left="600" w:hanging="360"/>
-      </w:pPr>
-      <w:rPr>
-        <w:rFonts w:ascii="Arial" w:cs="Arial" w:eastAsia="Arial" w:hAnsi="Arial"/>
-        <w:b w:val="0"/>
-        <w:bCs w:val="0"/>
-        <w:i w:val="0"/>
-        <w:iCs w:val="0"/>
-        <w:smallCaps w:val="0"/>
-        <w:strike w:val="0"/>
-        <w:color w:val="000000"/>
-        <w:sz w:val="22"/>
-        <w:szCs w:val="22"/>
-        <w:u w:val="none"/>
-        <w:shd w:fill="auto" w:val="clear"/>
-        <w:vertAlign w:val="baseline"/>
+        <w:ind w:left="720" w:hanging="360"/>
+      </w:pPr>
+      <w:rPr>
+        <w:u w:val="none"/>
       </w:rPr>
     </w:lvl>
     <w:lvl w:ilvl="1">
@@ -1805,19 +2148,7 @@
         <w:ind w:left="1440" w:hanging="360"/>
       </w:pPr>
       <w:rPr>
-        <w:rFonts w:ascii="Arial" w:cs="Arial" w:eastAsia="Arial" w:hAnsi="Arial"/>
-        <w:b w:val="0"/>
-        <w:bCs w:val="0"/>
-        <w:i w:val="0"/>
-        <w:iCs w:val="0"/>
-        <w:smallCaps w:val="0"/>
-        <w:strike w:val="0"/>
-        <w:color w:val="000000"/>
-        <w:sz w:val="22"/>
-        <w:szCs w:val="22"/>
-        <w:u w:val="none"/>
-        <w:shd w:fill="auto" w:val="clear"/>
-        <w:vertAlign w:val="baseline"/>
+        <w:u w:val="none"/>
       </w:rPr>
     </w:lvl>
     <w:lvl w:ilvl="2">
@@ -1829,67 +2160,31 @@
         <w:ind w:left="2160" w:hanging="360"/>
       </w:pPr>
       <w:rPr>
-        <w:rFonts w:ascii="Arial" w:cs="Arial" w:eastAsia="Arial" w:hAnsi="Arial"/>
-        <w:b w:val="0"/>
-        <w:bCs w:val="0"/>
-        <w:i w:val="0"/>
-        <w:iCs w:val="0"/>
-        <w:smallCaps w:val="0"/>
-        <w:strike w:val="0"/>
-        <w:color w:val="000000"/>
-        <w:sz w:val="22"/>
-        <w:szCs w:val="22"/>
-        <w:u w:val="none"/>
-        <w:shd w:fill="auto" w:val="clear"/>
-        <w:vertAlign w:val="baseline"/>
+        <w:u w:val="none"/>
       </w:rPr>
     </w:lvl>
     <w:lvl w:ilvl="3">
       <w:start w:val="1"/>
       <w:numFmt w:val="bullet"/>
-      <w:lvlText w:val="■"/>
+      <w:lvlText w:val="●"/>
       <w:lvlJc w:val="left"/>
       <w:pPr>
         <w:ind w:left="2880" w:hanging="360"/>
       </w:pPr>
       <w:rPr>
-        <w:rFonts w:ascii="Arial" w:cs="Arial" w:eastAsia="Arial" w:hAnsi="Arial"/>
-        <w:b w:val="0"/>
-        <w:bCs w:val="0"/>
-        <w:i w:val="0"/>
-        <w:iCs w:val="0"/>
-        <w:smallCaps w:val="0"/>
-        <w:strike w:val="0"/>
-        <w:color w:val="000000"/>
-        <w:sz w:val="22"/>
-        <w:szCs w:val="22"/>
-        <w:u w:val="none"/>
-        <w:shd w:fill="auto" w:val="clear"/>
-        <w:vertAlign w:val="baseline"/>
+        <w:u w:val="none"/>
       </w:rPr>
     </w:lvl>
     <w:lvl w:ilvl="4">
       <w:start w:val="1"/>
       <w:numFmt w:val="bullet"/>
-      <w:lvlText w:val="■"/>
+      <w:lvlText w:val="○"/>
       <w:lvlJc w:val="left"/>
       <w:pPr>
         <w:ind w:left="3600" w:hanging="360"/>
       </w:pPr>
       <w:rPr>
-        <w:rFonts w:ascii="Arial" w:cs="Arial" w:eastAsia="Arial" w:hAnsi="Arial"/>
-        <w:b w:val="0"/>
-        <w:bCs w:val="0"/>
-        <w:i w:val="0"/>
-        <w:iCs w:val="0"/>
-        <w:smallCaps w:val="0"/>
-        <w:strike w:val="0"/>
-        <w:color w:val="000000"/>
-        <w:sz w:val="22"/>
-        <w:szCs w:val="22"/>
-        <w:u w:val="none"/>
-        <w:shd w:fill="auto" w:val="clear"/>
-        <w:vertAlign w:val="baseline"/>
+        <w:u w:val="none"/>
       </w:rPr>
     </w:lvl>
     <w:lvl w:ilvl="5">
@@ -1901,67 +2196,31 @@
         <w:ind w:left="4320" w:hanging="360"/>
       </w:pPr>
       <w:rPr>
-        <w:rFonts w:ascii="Arial" w:cs="Arial" w:eastAsia="Arial" w:hAnsi="Arial"/>
-        <w:b w:val="0"/>
-        <w:bCs w:val="0"/>
-        <w:i w:val="0"/>
-        <w:iCs w:val="0"/>
-        <w:smallCaps w:val="0"/>
-        <w:strike w:val="0"/>
-        <w:color w:val="000000"/>
-        <w:sz w:val="22"/>
-        <w:szCs w:val="22"/>
-        <w:u w:val="none"/>
-        <w:shd w:fill="auto" w:val="clear"/>
-        <w:vertAlign w:val="baseline"/>
+        <w:u w:val="none"/>
       </w:rPr>
     </w:lvl>
     <w:lvl w:ilvl="6">
       <w:start w:val="1"/>
       <w:numFmt w:val="bullet"/>
-      <w:lvlText w:val="■"/>
+      <w:lvlText w:val="●"/>
       <w:lvlJc w:val="left"/>
       <w:pPr>
         <w:ind w:left="5040" w:hanging="360"/>
       </w:pPr>
       <w:rPr>
-        <w:rFonts w:ascii="Arial" w:cs="Arial" w:eastAsia="Arial" w:hAnsi="Arial"/>
-        <w:b w:val="0"/>
-        <w:bCs w:val="0"/>
-        <w:i w:val="0"/>
-        <w:iCs w:val="0"/>
-        <w:smallCaps w:val="0"/>
-        <w:strike w:val="0"/>
-        <w:color w:val="000000"/>
-        <w:sz w:val="22"/>
-        <w:szCs w:val="22"/>
-        <w:u w:val="none"/>
-        <w:shd w:fill="auto" w:val="clear"/>
-        <w:vertAlign w:val="baseline"/>
+        <w:u w:val="none"/>
       </w:rPr>
     </w:lvl>
     <w:lvl w:ilvl="7">
       <w:start w:val="1"/>
       <w:numFmt w:val="bullet"/>
-      <w:lvlText w:val="■"/>
+      <w:lvlText w:val="○"/>
       <w:lvlJc w:val="left"/>
       <w:pPr>
         <w:ind w:left="5760" w:hanging="360"/>
       </w:pPr>
       <w:rPr>
-        <w:rFonts w:ascii="Arial" w:cs="Arial" w:eastAsia="Arial" w:hAnsi="Arial"/>
-        <w:b w:val="0"/>
-        <w:bCs w:val="0"/>
-        <w:i w:val="0"/>
-        <w:iCs w:val="0"/>
-        <w:smallCaps w:val="0"/>
-        <w:strike w:val="0"/>
-        <w:color w:val="000000"/>
-        <w:sz w:val="22"/>
-        <w:szCs w:val="22"/>
-        <w:u w:val="none"/>
-        <w:shd w:fill="auto" w:val="clear"/>
-        <w:vertAlign w:val="baseline"/>
+        <w:u w:val="none"/>
       </w:rPr>
     </w:lvl>
     <w:lvl w:ilvl="8">
@@ -1973,45 +2232,21 @@
         <w:ind w:left="6480" w:hanging="360"/>
       </w:pPr>
       <w:rPr>
-        <w:rFonts w:ascii="Arial" w:cs="Arial" w:eastAsia="Arial" w:hAnsi="Arial"/>
-        <w:b w:val="0"/>
-        <w:bCs w:val="0"/>
-        <w:i w:val="0"/>
-        <w:iCs w:val="0"/>
-        <w:smallCaps w:val="0"/>
-        <w:strike w:val="0"/>
-        <w:color w:val="000000"/>
-        <w:sz w:val="22"/>
-        <w:szCs w:val="22"/>
-        <w:u w:val="none"/>
-        <w:shd w:fill="auto" w:val="clear"/>
-        <w:vertAlign w:val="baseline"/>
+        <w:u w:val="none"/>
       </w:rPr>
     </w:lvl>
   </w:abstractNum>
   <w:abstractNum w:abstractNumId="2">
     <w:lvl w:ilvl="0">
       <w:start w:val="1"/>
-      <w:numFmt w:val="decimal"/>
-      <w:lvlText w:val="%1."/>
-      <w:lvlJc w:val="left"/>
-      <w:pPr>
-        <w:ind w:left="600" w:hanging="360"/>
-      </w:pPr>
-      <w:rPr>
-        <w:rFonts w:ascii="Arial" w:cs="Arial" w:eastAsia="Arial" w:hAnsi="Arial"/>
-        <w:b w:val="0"/>
-        <w:bCs w:val="0"/>
-        <w:i w:val="0"/>
-        <w:iCs w:val="0"/>
-        <w:smallCaps w:val="0"/>
-        <w:strike w:val="0"/>
-        <w:color w:val="000000"/>
-        <w:sz w:val="22"/>
-        <w:szCs w:val="22"/>
-        <w:u w:val="none"/>
-        <w:shd w:fill="auto" w:val="clear"/>
-        <w:vertAlign w:val="baseline"/>
+      <w:numFmt w:val="bullet"/>
+      <w:lvlText w:val="●"/>
+      <w:lvlJc w:val="left"/>
+      <w:pPr>
+        <w:ind w:left="720" w:hanging="360"/>
+      </w:pPr>
+      <w:rPr>
+        <w:u w:val="none"/>
       </w:rPr>
     </w:lvl>
     <w:lvl w:ilvl="1">
@@ -2023,19 +2258,7 @@
         <w:ind w:left="1440" w:hanging="360"/>
       </w:pPr>
       <w:rPr>
-        <w:rFonts w:ascii="Arial" w:cs="Arial" w:eastAsia="Arial" w:hAnsi="Arial"/>
-        <w:b w:val="0"/>
-        <w:bCs w:val="0"/>
-        <w:i w:val="0"/>
-        <w:iCs w:val="0"/>
-        <w:smallCaps w:val="0"/>
-        <w:strike w:val="0"/>
-        <w:color w:val="000000"/>
-        <w:sz w:val="22"/>
-        <w:szCs w:val="22"/>
-        <w:u w:val="none"/>
-        <w:shd w:fill="auto" w:val="clear"/>
-        <w:vertAlign w:val="baseline"/>
+        <w:u w:val="none"/>
       </w:rPr>
     </w:lvl>
     <w:lvl w:ilvl="2">
@@ -2047,67 +2270,31 @@
         <w:ind w:left="2160" w:hanging="360"/>
       </w:pPr>
       <w:rPr>
-        <w:rFonts w:ascii="Arial" w:cs="Arial" w:eastAsia="Arial" w:hAnsi="Arial"/>
-        <w:b w:val="0"/>
-        <w:bCs w:val="0"/>
-        <w:i w:val="0"/>
-        <w:iCs w:val="0"/>
-        <w:smallCaps w:val="0"/>
-        <w:strike w:val="0"/>
-        <w:color w:val="000000"/>
-        <w:sz w:val="22"/>
-        <w:szCs w:val="22"/>
-        <w:u w:val="none"/>
-        <w:shd w:fill="auto" w:val="clear"/>
-        <w:vertAlign w:val="baseline"/>
+        <w:u w:val="none"/>
       </w:rPr>
     </w:lvl>
     <w:lvl w:ilvl="3">
       <w:start w:val="1"/>
       <w:numFmt w:val="bullet"/>
-      <w:lvlText w:val="■"/>
+      <w:lvlText w:val="●"/>
       <w:lvlJc w:val="left"/>
       <w:pPr>
         <w:ind w:left="2880" w:hanging="360"/>
       </w:pPr>
       <w:rPr>
-        <w:rFonts w:ascii="Arial" w:cs="Arial" w:eastAsia="Arial" w:hAnsi="Arial"/>
-        <w:b w:val="0"/>
-        <w:bCs w:val="0"/>
-        <w:i w:val="0"/>
-        <w:iCs w:val="0"/>
-        <w:smallCaps w:val="0"/>
-        <w:strike w:val="0"/>
-        <w:color w:val="000000"/>
-        <w:sz w:val="22"/>
-        <w:szCs w:val="22"/>
-        <w:u w:val="none"/>
-        <w:shd w:fill="auto" w:val="clear"/>
-        <w:vertAlign w:val="baseline"/>
+        <w:u w:val="none"/>
       </w:rPr>
     </w:lvl>
     <w:lvl w:ilvl="4">
       <w:start w:val="1"/>
       <w:numFmt w:val="bullet"/>
-      <w:lvlText w:val="■"/>
+      <w:lvlText w:val="○"/>
       <w:lvlJc w:val="left"/>
       <w:pPr>
         <w:ind w:left="3600" w:hanging="360"/>
       </w:pPr>
       <w:rPr>
-        <w:rFonts w:ascii="Arial" w:cs="Arial" w:eastAsia="Arial" w:hAnsi="Arial"/>
-        <w:b w:val="0"/>
-        <w:bCs w:val="0"/>
-        <w:i w:val="0"/>
-        <w:iCs w:val="0"/>
-        <w:smallCaps w:val="0"/>
-        <w:strike w:val="0"/>
-        <w:color w:val="000000"/>
-        <w:sz w:val="22"/>
-        <w:szCs w:val="22"/>
-        <w:u w:val="none"/>
-        <w:shd w:fill="auto" w:val="clear"/>
-        <w:vertAlign w:val="baseline"/>
+        <w:u w:val="none"/>
       </w:rPr>
     </w:lvl>
     <w:lvl w:ilvl="5">
@@ -2119,67 +2306,31 @@
         <w:ind w:left="4320" w:hanging="360"/>
       </w:pPr>
       <w:rPr>
-        <w:rFonts w:ascii="Arial" w:cs="Arial" w:eastAsia="Arial" w:hAnsi="Arial"/>
-        <w:b w:val="0"/>
-        <w:bCs w:val="0"/>
-        <w:i w:val="0"/>
-        <w:iCs w:val="0"/>
-        <w:smallCaps w:val="0"/>
-        <w:strike w:val="0"/>
-        <w:color w:val="000000"/>
-        <w:sz w:val="22"/>
-        <w:szCs w:val="22"/>
-        <w:u w:val="none"/>
-        <w:shd w:fill="auto" w:val="clear"/>
-        <w:vertAlign w:val="baseline"/>
+        <w:u w:val="none"/>
       </w:rPr>
     </w:lvl>
     <w:lvl w:ilvl="6">
       <w:start w:val="1"/>
       <w:numFmt w:val="bullet"/>
-      <w:lvlText w:val="■"/>
+      <w:lvlText w:val="●"/>
       <w:lvlJc w:val="left"/>
       <w:pPr>
         <w:ind w:left="5040" w:hanging="360"/>
       </w:pPr>
       <w:rPr>
-        <w:rFonts w:ascii="Arial" w:cs="Arial" w:eastAsia="Arial" w:hAnsi="Arial"/>
-        <w:b w:val="0"/>
-        <w:bCs w:val="0"/>
-        <w:i w:val="0"/>
-        <w:iCs w:val="0"/>
-        <w:smallCaps w:val="0"/>
-        <w:strike w:val="0"/>
-        <w:color w:val="000000"/>
-        <w:sz w:val="22"/>
-        <w:szCs w:val="22"/>
-        <w:u w:val="none"/>
-        <w:shd w:fill="auto" w:val="clear"/>
-        <w:vertAlign w:val="baseline"/>
+        <w:u w:val="none"/>
       </w:rPr>
     </w:lvl>
     <w:lvl w:ilvl="7">
       <w:start w:val="1"/>
       <w:numFmt w:val="bullet"/>
-      <w:lvlText w:val="■"/>
+      <w:lvlText w:val="○"/>
       <w:lvlJc w:val="left"/>
       <w:pPr>
         <w:ind w:left="5760" w:hanging="360"/>
       </w:pPr>
       <w:rPr>
-        <w:rFonts w:ascii="Arial" w:cs="Arial" w:eastAsia="Arial" w:hAnsi="Arial"/>
-        <w:b w:val="0"/>
-        <w:bCs w:val="0"/>
-        <w:i w:val="0"/>
-        <w:iCs w:val="0"/>
-        <w:smallCaps w:val="0"/>
-        <w:strike w:val="0"/>
-        <w:color w:val="000000"/>
-        <w:sz w:val="22"/>
-        <w:szCs w:val="22"/>
-        <w:u w:val="none"/>
-        <w:shd w:fill="auto" w:val="clear"/>
-        <w:vertAlign w:val="baseline"/>
+        <w:u w:val="none"/>
       </w:rPr>
     </w:lvl>
     <w:lvl w:ilvl="8">
@@ -2191,19 +2342,7 @@
         <w:ind w:left="6480" w:hanging="360"/>
       </w:pPr>
       <w:rPr>
-        <w:rFonts w:ascii="Arial" w:cs="Arial" w:eastAsia="Arial" w:hAnsi="Arial"/>
-        <w:b w:val="0"/>
-        <w:bCs w:val="0"/>
-        <w:i w:val="0"/>
-        <w:iCs w:val="0"/>
-        <w:smallCaps w:val="0"/>
-        <w:strike w:val="0"/>
-        <w:color w:val="000000"/>
-        <w:sz w:val="22"/>
-        <w:szCs w:val="22"/>
-        <w:u w:val="none"/>
-        <w:shd w:fill="auto" w:val="clear"/>
-        <w:vertAlign w:val="baseline"/>
+        <w:u w:val="none"/>
       </w:rPr>
     </w:lvl>
   </w:abstractNum>
@@ -2428,8 +2567,8 @@
   <w:abstractNum w:abstractNumId="4">
     <w:lvl w:ilvl="0">
       <w:start w:val="1"/>
-      <w:numFmt w:val="bullet"/>
-      <w:lvlText w:val="●"/>
+      <w:numFmt w:val="decimal"/>
+      <w:lvlText w:val="%1."/>
       <w:lvlJc w:val="left"/>
       <w:pPr>
         <w:ind w:left="600" w:hanging="360"/>
@@ -2456,7 +2595,7 @@
       <w:lvlText w:val="○"/>
       <w:lvlJc w:val="left"/>
       <w:pPr>
-        <w:ind w:left="1200" w:hanging="360"/>
+        <w:ind w:left="1440" w:hanging="360"/>
       </w:pPr>
       <w:rPr>
         <w:rFonts w:ascii="Arial" w:cs="Arial" w:eastAsia="Arial" w:hAnsi="Arial"/>
@@ -2674,7 +2813,7 @@
       <w:lvlText w:val="○"/>
       <w:lvlJc w:val="left"/>
       <w:pPr>
-        <w:ind w:left="1200" w:hanging="360"/>
+        <w:ind w:left="1440" w:hanging="360"/>
       </w:pPr>
       <w:rPr>
         <w:rFonts w:ascii="Arial" w:cs="Arial" w:eastAsia="Arial" w:hAnsi="Arial"/>
@@ -3512,6 +3651,226 @@
         <w:u w:val="none"/>
         <w:shd w:fill="auto" w:val="clear"/>
         <w:vertAlign w:val="baseline"/>
+      </w:rPr>
+    </w:lvl>
+  </w:abstractNum>
+  <w:abstractNum w:abstractNumId="9">
+    <w:lvl w:ilvl="0">
+      <w:start w:val="1"/>
+      <w:numFmt w:val="bullet"/>
+      <w:lvlText w:val="●"/>
+      <w:lvlJc w:val="left"/>
+      <w:pPr>
+        <w:ind w:left="720" w:hanging="360"/>
+      </w:pPr>
+      <w:rPr>
+        <w:u w:val="none"/>
+      </w:rPr>
+    </w:lvl>
+    <w:lvl w:ilvl="1">
+      <w:start w:val="1"/>
+      <w:numFmt w:val="bullet"/>
+      <w:lvlText w:val="○"/>
+      <w:lvlJc w:val="left"/>
+      <w:pPr>
+        <w:ind w:left="1440" w:hanging="360"/>
+      </w:pPr>
+      <w:rPr>
+        <w:u w:val="none"/>
+      </w:rPr>
+    </w:lvl>
+    <w:lvl w:ilvl="2">
+      <w:start w:val="1"/>
+      <w:numFmt w:val="bullet"/>
+      <w:lvlText w:val="■"/>
+      <w:lvlJc w:val="left"/>
+      <w:pPr>
+        <w:ind w:left="2160" w:hanging="360"/>
+      </w:pPr>
+      <w:rPr>
+        <w:u w:val="none"/>
+      </w:rPr>
+    </w:lvl>
+    <w:lvl w:ilvl="3">
+      <w:start w:val="1"/>
+      <w:numFmt w:val="bullet"/>
+      <w:lvlText w:val="●"/>
+      <w:lvlJc w:val="left"/>
+      <w:pPr>
+        <w:ind w:left="2880" w:hanging="360"/>
+      </w:pPr>
+      <w:rPr>
+        <w:u w:val="none"/>
+      </w:rPr>
+    </w:lvl>
+    <w:lvl w:ilvl="4">
+      <w:start w:val="1"/>
+      <w:numFmt w:val="bullet"/>
+      <w:lvlText w:val="○"/>
+      <w:lvlJc w:val="left"/>
+      <w:pPr>
+        <w:ind w:left="3600" w:hanging="360"/>
+      </w:pPr>
+      <w:rPr>
+        <w:u w:val="none"/>
+      </w:rPr>
+    </w:lvl>
+    <w:lvl w:ilvl="5">
+      <w:start w:val="1"/>
+      <w:numFmt w:val="bullet"/>
+      <w:lvlText w:val="■"/>
+      <w:lvlJc w:val="left"/>
+      <w:pPr>
+        <w:ind w:left="4320" w:hanging="360"/>
+      </w:pPr>
+      <w:rPr>
+        <w:u w:val="none"/>
+      </w:rPr>
+    </w:lvl>
+    <w:lvl w:ilvl="6">
+      <w:start w:val="1"/>
+      <w:numFmt w:val="bullet"/>
+      <w:lvlText w:val="●"/>
+      <w:lvlJc w:val="left"/>
+      <w:pPr>
+        <w:ind w:left="5040" w:hanging="360"/>
+      </w:pPr>
+      <w:rPr>
+        <w:u w:val="none"/>
+      </w:rPr>
+    </w:lvl>
+    <w:lvl w:ilvl="7">
+      <w:start w:val="1"/>
+      <w:numFmt w:val="bullet"/>
+      <w:lvlText w:val="○"/>
+      <w:lvlJc w:val="left"/>
+      <w:pPr>
+        <w:ind w:left="5760" w:hanging="360"/>
+      </w:pPr>
+      <w:rPr>
+        <w:u w:val="none"/>
+      </w:rPr>
+    </w:lvl>
+    <w:lvl w:ilvl="8">
+      <w:start w:val="1"/>
+      <w:numFmt w:val="bullet"/>
+      <w:lvlText w:val="■"/>
+      <w:lvlJc w:val="left"/>
+      <w:pPr>
+        <w:ind w:left="6480" w:hanging="360"/>
+      </w:pPr>
+      <w:rPr>
+        <w:u w:val="none"/>
+      </w:rPr>
+    </w:lvl>
+  </w:abstractNum>
+  <w:abstractNum w:abstractNumId="10">
+    <w:lvl w:ilvl="0">
+      <w:start w:val="1"/>
+      <w:numFmt w:val="bullet"/>
+      <w:lvlText w:val="●"/>
+      <w:lvlJc w:val="left"/>
+      <w:pPr>
+        <w:ind w:left="720" w:hanging="360"/>
+      </w:pPr>
+      <w:rPr>
+        <w:u w:val="none"/>
+      </w:rPr>
+    </w:lvl>
+    <w:lvl w:ilvl="1">
+      <w:start w:val="1"/>
+      <w:numFmt w:val="bullet"/>
+      <w:lvlText w:val="○"/>
+      <w:lvlJc w:val="left"/>
+      <w:pPr>
+        <w:ind w:left="1440" w:hanging="360"/>
+      </w:pPr>
+      <w:rPr>
+        <w:u w:val="none"/>
+      </w:rPr>
+    </w:lvl>
+    <w:lvl w:ilvl="2">
+      <w:start w:val="1"/>
+      <w:numFmt w:val="bullet"/>
+      <w:lvlText w:val="■"/>
+      <w:lvlJc w:val="left"/>
+      <w:pPr>
+        <w:ind w:left="2160" w:hanging="360"/>
+      </w:pPr>
+      <w:rPr>
+        <w:u w:val="none"/>
+      </w:rPr>
+    </w:lvl>
+    <w:lvl w:ilvl="3">
+      <w:start w:val="1"/>
+      <w:numFmt w:val="bullet"/>
+      <w:lvlText w:val="●"/>
+      <w:lvlJc w:val="left"/>
+      <w:pPr>
+        <w:ind w:left="2880" w:hanging="360"/>
+      </w:pPr>
+      <w:rPr>
+        <w:u w:val="none"/>
+      </w:rPr>
+    </w:lvl>
+    <w:lvl w:ilvl="4">
+      <w:start w:val="1"/>
+      <w:numFmt w:val="bullet"/>
+      <w:lvlText w:val="○"/>
+      <w:lvlJc w:val="left"/>
+      <w:pPr>
+        <w:ind w:left="3600" w:hanging="360"/>
+      </w:pPr>
+      <w:rPr>
+        <w:u w:val="none"/>
+      </w:rPr>
+    </w:lvl>
+    <w:lvl w:ilvl="5">
+      <w:start w:val="1"/>
+      <w:numFmt w:val="bullet"/>
+      <w:lvlText w:val="■"/>
+      <w:lvlJc w:val="left"/>
+      <w:pPr>
+        <w:ind w:left="4320" w:hanging="360"/>
+      </w:pPr>
+      <w:rPr>
+        <w:u w:val="none"/>
+      </w:rPr>
+    </w:lvl>
+    <w:lvl w:ilvl="6">
+      <w:start w:val="1"/>
+      <w:numFmt w:val="bullet"/>
+      <w:lvlText w:val="●"/>
+      <w:lvlJc w:val="left"/>
+      <w:pPr>
+        <w:ind w:left="5040" w:hanging="360"/>
+      </w:pPr>
+      <w:rPr>
+        <w:u w:val="none"/>
+      </w:rPr>
+    </w:lvl>
+    <w:lvl w:ilvl="7">
+      <w:start w:val="1"/>
+      <w:numFmt w:val="bullet"/>
+      <w:lvlText w:val="○"/>
+      <w:lvlJc w:val="left"/>
+      <w:pPr>
+        <w:ind w:left="5760" w:hanging="360"/>
+      </w:pPr>
+      <w:rPr>
+        <w:u w:val="none"/>
+      </w:rPr>
+    </w:lvl>
+    <w:lvl w:ilvl="8">
+      <w:start w:val="1"/>
+      <w:numFmt w:val="bullet"/>
+      <w:lvlText w:val="■"/>
+      <w:lvlJc w:val="left"/>
+      <w:pPr>
+        <w:ind w:left="6480" w:hanging="360"/>
+      </w:pPr>
+      <w:rPr>
+        <w:u w:val="none"/>
       </w:rPr>
     </w:lvl>
   </w:abstractNum>
@@ -3538,6 +3897,12 @@
   </w:num>
   <w:num w:numId="8">
     <w:abstractNumId w:val="8"/>
+  </w:num>
+  <w:num w:numId="9">
+    <w:abstractNumId w:val="9"/>
+  </w:num>
+  <w:num w:numId="10">
+    <w:abstractNumId w:val="10"/>
   </w:num>
 </w:numbering>
 </file>

</xml_diff>

<commit_message>
added notebook, modified docs
</commit_message>
<xml_diff>
--- a/Project Report_Dagents project.docx
+++ b/Project Report_Dagents project.docx
@@ -98,7 +98,7 @@
       <w:pPr>
         <w:numPr>
           <w:ilvl w:val="0"/>
-          <w:numId w:val="3"/>
+          <w:numId w:val="4"/>
         </w:numPr>
         <w:pBdr>
           <w:top w:space="0" w:sz="0" w:val="nil"/>
@@ -132,7 +132,7 @@
       <w:pPr>
         <w:numPr>
           <w:ilvl w:val="0"/>
-          <w:numId w:val="3"/>
+          <w:numId w:val="4"/>
         </w:numPr>
         <w:pBdr>
           <w:top w:space="0" w:sz="0" w:val="nil"/>
@@ -369,7 +369,7 @@
       <w:pPr>
         <w:numPr>
           <w:ilvl w:val="0"/>
-          <w:numId w:val="4"/>
+          <w:numId w:val="5"/>
         </w:numPr>
         <w:pBdr>
           <w:top w:space="0" w:sz="0" w:val="nil"/>
@@ -425,7 +425,7 @@
       <w:pPr>
         <w:numPr>
           <w:ilvl w:val="0"/>
-          <w:numId w:val="4"/>
+          <w:numId w:val="5"/>
         </w:numPr>
         <w:pBdr>
           <w:top w:space="0" w:sz="0" w:val="nil"/>
@@ -478,7 +478,7 @@
       <w:pPr>
         <w:numPr>
           <w:ilvl w:val="0"/>
-          <w:numId w:val="4"/>
+          <w:numId w:val="5"/>
         </w:numPr>
         <w:pBdr>
           <w:top w:space="0" w:sz="0" w:val="nil"/>
@@ -531,7 +531,7 @@
       <w:pPr>
         <w:numPr>
           <w:ilvl w:val="0"/>
-          <w:numId w:val="4"/>
+          <w:numId w:val="5"/>
         </w:numPr>
         <w:pBdr>
           <w:top w:space="0" w:sz="0" w:val="nil"/>
@@ -582,6 +582,89 @@
     </w:p>
     <w:p>
       <w:pPr>
+        <w:numPr>
+          <w:ilvl w:val="0"/>
+          <w:numId w:val="5"/>
+        </w:numPr>
+        <w:spacing w:line="275.9999942779541" w:lineRule="auto"/>
+        <w:ind w:left="600" w:hanging="360"/>
+      </w:pPr>
+      <w:r>
+        <w:rPr>
+          <w:b w:val="1"/>
+          <w:bCs w:val="1"/>
+          <w:rtl w:val="0"/>
+        </w:rPr>
+        <w:t xml:space="preserve">Zero-Shot Specialized LLM (</w:t>
+      </w:r>
+      <w:r>
+        <w:rPr>
+          <w:rFonts w:ascii="Roboto Mono" w:cs="Roboto Mono" w:eastAsia="Roboto Mono" w:hAnsi="Roboto Mono"/>
+          <w:b w:val="1"/>
+          <w:bCs w:val="1"/>
+          <w:color w:val="188038"/>
+          <w:rtl w:val="0"/>
+        </w:rPr>
+        <w:t xml:space="preserve">defog/llama-3-sqlcoder-8b</w:t>
+      </w:r>
+      <w:r>
+        <w:rPr>
+          <w:b w:val="1"/>
+          <w:bCs w:val="1"/>
+          <w:rtl w:val="0"/>
+        </w:rPr>
+        <w:t xml:space="preserve">):</w:t>
+      </w:r>
+      <w:r>
+        <w:rPr>
+          <w:rtl w:val="0"/>
+        </w:rPr>
+        <w:t xml:space="preserve"> To establish a rigorous baseline, we tested a state-of-the-art, purpose-built SQL LLM (8B parameters).</w:t>
+      </w:r>
+    </w:p>
+    <w:p>
+      <w:pPr>
+        <w:spacing w:line="275.9999942779541" w:lineRule="auto"/>
+        <w:ind w:left="600" w:firstLine="0"/>
+        <w:rPr/>
+      </w:pPr>
+      <w:r>
+        <w:rPr>
+          <w:i w:val="1"/>
+          <w:iCs w:val="1"/>
+          <w:rtl w:val="0"/>
+        </w:rPr>
+        <w:t xml:space="preserve">Justification:</w:t>
+      </w:r>
+      <w:r>
+        <w:rPr>
+          <w:rtl w:val="0"/>
+        </w:rPr>
+        <w:t xml:space="preserve"> We needed to determine if the problem of Natural Language to SQL could be solved purely through advanced Prompt Engineering and regex-based post-processing on a specialized model without doing any fine-tuning.</w:t>
+      </w:r>
+    </w:p>
+    <w:p>
+      <w:pPr>
+        <w:pBdr>
+          <w:top w:space="0" w:sz="0" w:val="nil"/>
+          <w:left w:space="0" w:sz="0" w:val="nil"/>
+          <w:bottom w:space="0" w:sz="0" w:val="nil"/>
+          <w:right w:space="0" w:sz="0" w:val="nil"/>
+          <w:between w:space="0" w:sz="0" w:val="nil"/>
+        </w:pBdr>
+        <w:shd w:fill="auto" w:val="clear"/>
+        <w:spacing w:line="275.9999942779541" w:lineRule="auto"/>
+        <w:ind w:left="600" w:firstLine="0"/>
+        <w:rPr/>
+      </w:pPr>
+      <w:r>
+        <w:rPr>
+          <w:rtl w:val="0"/>
+        </w:rPr>
+      </w:r>
+    </w:p>
+    <w:p>
+      <w:pPr>
         <w:pStyle w:val="Heading3"/>
         <w:pBdr>
           <w:top w:space="0" w:sz="0" w:val="nil"/>
@@ -620,7 +703,7 @@
       <w:pPr>
         <w:numPr>
           <w:ilvl w:val="0"/>
-          <w:numId w:val="5"/>
+          <w:numId w:val="6"/>
         </w:numPr>
         <w:pBdr>
           <w:top w:space="0" w:sz="0" w:val="nil"/>
@@ -654,7 +737,7 @@
       <w:pPr>
         <w:numPr>
           <w:ilvl w:val="0"/>
-          <w:numId w:val="5"/>
+          <w:numId w:val="6"/>
         </w:numPr>
         <w:pBdr>
           <w:top w:space="0" w:sz="0" w:val="nil"/>
@@ -707,7 +790,7 @@
       <w:pPr>
         <w:numPr>
           <w:ilvl w:val="0"/>
-          <w:numId w:val="5"/>
+          <w:numId w:val="6"/>
         </w:numPr>
         <w:pBdr>
           <w:top w:space="0" w:sz="0" w:val="nil"/>
@@ -835,7 +918,7 @@
       <w:pPr>
         <w:numPr>
           <w:ilvl w:val="0"/>
-          <w:numId w:val="6"/>
+          <w:numId w:val="7"/>
         </w:numPr>
         <w:pBdr>
           <w:top w:space="0" w:sz="0" w:val="nil"/>
@@ -888,7 +971,7 @@
       <w:pPr>
         <w:numPr>
           <w:ilvl w:val="0"/>
-          <w:numId w:val="6"/>
+          <w:numId w:val="7"/>
         </w:numPr>
         <w:pBdr>
           <w:top w:space="0" w:sz="0" w:val="nil"/>
@@ -941,7 +1024,7 @@
       <w:pPr>
         <w:numPr>
           <w:ilvl w:val="0"/>
-          <w:numId w:val="6"/>
+          <w:numId w:val="7"/>
         </w:numPr>
         <w:pBdr>
           <w:top w:space="0" w:sz="0" w:val="nil"/>
@@ -968,7 +1051,7 @@
       <w:pPr>
         <w:numPr>
           <w:ilvl w:val="1"/>
-          <w:numId w:val="7"/>
+          <w:numId w:val="8"/>
         </w:numPr>
         <w:pBdr>
           <w:top w:space="0" w:sz="0" w:val="nil"/>
@@ -1021,7 +1104,7 @@
       <w:pPr>
         <w:numPr>
           <w:ilvl w:val="1"/>
-          <w:numId w:val="7"/>
+          <w:numId w:val="8"/>
         </w:numPr>
         <w:pBdr>
           <w:top w:space="0" w:sz="0" w:val="nil"/>
@@ -1074,7 +1157,7 @@
       <w:pPr>
         <w:numPr>
           <w:ilvl w:val="1"/>
-          <w:numId w:val="7"/>
+          <w:numId w:val="8"/>
         </w:numPr>
         <w:pBdr>
           <w:top w:space="0" w:sz="0" w:val="nil"/>
@@ -1127,7 +1210,7 @@
       <w:pPr>
         <w:numPr>
           <w:ilvl w:val="1"/>
-          <w:numId w:val="7"/>
+          <w:numId w:val="8"/>
         </w:numPr>
         <w:pBdr>
           <w:top w:space="0" w:sz="0" w:val="nil"/>
@@ -1171,6 +1254,52 @@
           <w:rtl w:val="0"/>
         </w:rPr>
         <w:t xml:space="preserve">.</w:t>
+      </w:r>
+    </w:p>
+    <w:p>
+      <w:pPr>
+        <w:numPr>
+          <w:ilvl w:val="0"/>
+          <w:numId w:val="8"/>
+        </w:numPr>
+        <w:pBdr>
+          <w:top w:space="0" w:sz="0" w:val="nil"/>
+          <w:left w:space="0" w:sz="0" w:val="nil"/>
+          <w:bottom w:space="0" w:sz="0" w:val="nil"/>
+          <w:right w:space="0" w:sz="0" w:val="nil"/>
+          <w:between w:space="0" w:sz="0" w:val="nil"/>
+        </w:pBdr>
+        <w:shd w:fill="auto" w:val="clear"/>
+        <w:spacing w:line="275.9999942779541" w:lineRule="auto"/>
+        <w:ind w:left="600" w:hanging="360"/>
+      </w:pPr>
+      <w:r>
+        <w:rPr>
+          <w:b w:val="1"/>
+          <w:bCs w:val="1"/>
+          <w:rtl w:val="0"/>
+        </w:rPr>
+        <w:t xml:space="preserve">Zero-Shot Prompt Engineering &amp; Post-Processing:</w:t>
+      </w:r>
+      <w:r>
+        <w:rPr>
+          <w:rtl w:val="0"/>
+        </w:rPr>
+        <w:t xml:space="preserve"> For the Llama-3-SQLCoder baseline, we engineered a strict, zero-tolerance prompt ("STRICT RULES: Do NOT output anything except SQL... Do NOT use table aliases unless necessary"). We also built a custom Python regex pipeline (</w:t>
+      </w:r>
+      <w:r>
+        <w:rPr>
+          <w:rFonts w:ascii="Roboto Mono" w:cs="Roboto Mono" w:eastAsia="Roboto Mono" w:hAnsi="Roboto Mono"/>
+          <w:color w:val="188038"/>
+          <w:rtl w:val="0"/>
+        </w:rPr>
+        <w:t xml:space="preserve">clean_sql</w:t>
+      </w:r>
+      <w:r>
+        <w:rPr>
+          <w:rtl w:val="0"/>
+        </w:rPr>
+        <w:t xml:space="preserve">) to strip out conversational filler (e.g., "assistant:"), slice at the first semicolon, and normalize brackets/spacing.</w:t>
       </w:r>
       <w:r>
         <w:rPr>
@@ -1462,6 +1591,43 @@
     </w:p>
     <w:p>
       <w:pPr>
+        <w:spacing w:after="240" w:before="240" w:line="275.9999942779541" w:lineRule="auto"/>
+        <w:rPr>
+          <w:rFonts w:ascii="Google Sans" w:cs="Google Sans" w:eastAsia="Google Sans" w:hAnsi="Google Sans"/>
+        </w:rPr>
+      </w:pPr>
+      <w:r>
+        <w:rPr>
+          <w:rtl w:val="0"/>
+        </w:rPr>
+      </w:r>
+    </w:p>
+    <w:p>
+      <w:pPr>
+        <w:spacing w:after="240" w:before="240" w:line="275.9999942779541" w:lineRule="auto"/>
+        <w:rPr>
+          <w:rFonts w:ascii="Google Sans" w:cs="Google Sans" w:eastAsia="Google Sans" w:hAnsi="Google Sans"/>
+        </w:rPr>
+      </w:pPr>
+      <w:r>
+        <w:rPr>
+          <w:rFonts w:ascii="Google Sans" w:cs="Google Sans" w:eastAsia="Google Sans" w:hAnsi="Google Sans"/>
+          <w:b w:val="1"/>
+          <w:bCs w:val="1"/>
+          <w:rtl w:val="0"/>
+        </w:rPr>
+        <w:t xml:space="preserve">3. Llama-3-SQLCoder-8B (Zero-Shot Baseline) Evaluation:</w:t>
+      </w:r>
+      <w:r>
+        <w:rPr>
+          <w:rFonts w:ascii="Google Sans" w:cs="Google Sans" w:eastAsia="Google Sans" w:hAnsi="Google Sans"/>
+          <w:rtl w:val="0"/>
+        </w:rPr>
+        <w:t xml:space="preserve"> Despite being a purpose-built SQL model, the zero-shot performance on a 100-sample subset of our data was highly revealing: Exact Match (EM): 0.00%, Proximal Match (≥ 0.7 threshold): 0.00%, Average Proximal Score (Token Overlap): ~36%.</w:t>
+      </w:r>
+    </w:p>
+    <w:p>
+      <w:pPr>
         <w:pStyle w:val="Heading4"/>
         <w:spacing w:after="40" w:before="240" w:line="275.9999942779541" w:lineRule="auto"/>
         <w:rPr>
@@ -1470,7 +1636,7 @@
           <w:szCs w:val="22"/>
         </w:rPr>
       </w:pPr>
-      <w:bookmarkStart w:colFirst="0" w:colLast="0" w:name="_s0p9j3fua9ul" w:id="0"/>
+      <w:bookmarkStart w:colFirst="0" w:colLast="0" w:name="_z9ksvcns8fj2" w:id="0"/>
       <w:bookmarkEnd w:id="0"/>
       <w:r>
         <w:rPr>
@@ -1479,7 +1645,7 @@
           <w:szCs w:val="22"/>
           <w:rtl w:val="0"/>
         </w:rPr>
-        <w:t xml:space="preserve">NOTE: The Evaluation Typology (A, B, C)</w:t>
+        <w:t xml:space="preserve">Why did a State-of-the-Art SQL Model Score 0%?</w:t>
       </w:r>
     </w:p>
     <w:p>
@@ -1492,25 +1658,16 @@
       <w:r>
         <w:rPr>
           <w:rFonts w:ascii="Google Sans" w:cs="Google Sans" w:eastAsia="Google Sans" w:hAnsi="Google Sans"/>
-          <w:b w:val="1"/>
-          <w:bCs w:val="1"/>
-          <w:rtl w:val="0"/>
-        </w:rPr>
-        <w:t xml:space="preserve">Type A: Syntactic Variations &amp; String Literal Noise (Logical Success, Metric Failure)</w:t>
-      </w:r>
-      <w:r>
-        <w:rPr>
-          <w:rFonts w:ascii="Google Sans" w:cs="Google Sans" w:eastAsia="Google Sans" w:hAnsi="Google Sans"/>
-          <w:rtl w:val="0"/>
-        </w:rPr>
-        <w:t xml:space="preserve"> Many queries marked as "Failures" by the Exact Match metric were actually functionally flawless.</w:t>
+          <w:rtl w:val="0"/>
+        </w:rPr>
+        <w:t xml:space="preserve">Applying our evaluation typology to the Llama-3-SQLCoder results explains this paradox:</w:t>
       </w:r>
     </w:p>
     <w:p>
       <w:pPr>
         <w:numPr>
           <w:ilvl w:val="0"/>
-          <w:numId w:val="10"/>
+          <w:numId w:val="3"/>
         </w:numPr>
         <w:spacing w:after="0" w:afterAutospacing="0" w:before="240" w:line="275.9999942779541" w:lineRule="auto"/>
         <w:ind w:left="720" w:hanging="360"/>
@@ -1521,6 +1678,163 @@
       <w:r>
         <w:rPr>
           <w:rFonts w:ascii="Google Sans" w:cs="Google Sans" w:eastAsia="Google Sans" w:hAnsi="Google Sans"/>
+          <w:b w:val="1"/>
+          <w:bCs w:val="1"/>
+          <w:rtl w:val="0"/>
+        </w:rPr>
+        <w:t xml:space="preserve">Massive Type A Failures (Dialect &amp; Syntactic Formatting):</w:t>
+      </w:r>
+      <w:r>
+        <w:rPr>
+          <w:rFonts w:ascii="Google Sans" w:cs="Google Sans" w:eastAsia="Google Sans" w:hAnsi="Google Sans"/>
+          <w:rtl w:val="0"/>
+        </w:rPr>
+        <w:t xml:space="preserve"> The model didn't score 0% because it forgot how to write SQL. It scored ~36% on average token overlap, meaning it consistently grasped the correct columns and keywords. However, zero-shot models are highly opinionated. SQLCoder defaults to specific SQL dialects (like PostgreSQL quoting conventions) and formatting styles. Even with a regex cleanup function, the strict Exact Match metric punished the model for using different casing, backticks, or alias structures that deviated from the dataset's ground truth.</w:t>
+      </w:r>
+    </w:p>
+    <w:p>
+      <w:pPr>
+        <w:numPr>
+          <w:ilvl w:val="0"/>
+          <w:numId w:val="3"/>
+        </w:numPr>
+        <w:spacing w:after="240" w:before="0" w:beforeAutospacing="0" w:line="275.9999942779541" w:lineRule="auto"/>
+        <w:ind w:left="720" w:hanging="360"/>
+        <w:rPr>
+          <w:rFonts w:ascii="Google Sans" w:cs="Google Sans" w:eastAsia="Google Sans" w:hAnsi="Google Sans"/>
+        </w:rPr>
+      </w:pPr>
+      <w:r>
+        <w:rPr>
+          <w:rFonts w:ascii="Google Sans" w:cs="Google Sans" w:eastAsia="Google Sans" w:hAnsi="Google Sans"/>
+          <w:b w:val="1"/>
+          <w:bCs w:val="1"/>
+          <w:rtl w:val="0"/>
+        </w:rPr>
+        <w:t xml:space="preserve">Type B Failures (Instruction Ignorance):</w:t>
+      </w:r>
+      <w:r>
+        <w:rPr>
+          <w:rFonts w:ascii="Google Sans" w:cs="Google Sans" w:eastAsia="Google Sans" w:hAnsi="Google Sans"/>
+          <w:rtl w:val="0"/>
+        </w:rPr>
+        <w:t xml:space="preserve"> Despite explicit prompt instructions like "Do NOT use table aliases," zero-shot models often default to their pre-trained habits. Because the model was not fine-tuned (aligned) to the specific distribution of our target dataset, it failed to strictly map its logic to the exact string format the evaluator expected.</w:t>
+      </w:r>
+    </w:p>
+    <w:p>
+      <w:pPr>
+        <w:spacing w:after="240" w:before="240" w:line="275.9999942779541" w:lineRule="auto"/>
+        <w:rPr>
+          <w:rFonts w:ascii="Google Sans" w:cs="Google Sans" w:eastAsia="Google Sans" w:hAnsi="Google Sans"/>
+        </w:rPr>
+      </w:pPr>
+      <w:r>
+        <w:rPr>
+          <w:rFonts w:ascii="Google Sans" w:cs="Google Sans" w:eastAsia="Google Sans" w:hAnsi="Google Sans"/>
+          <w:b w:val="1"/>
+          <w:bCs w:val="1"/>
+          <w:rtl w:val="0"/>
+        </w:rPr>
+        <w:t xml:space="preserve">The Key Takeaway:</w:t>
+      </w:r>
+      <w:r>
+        <w:rPr>
+          <w:rFonts w:ascii="Google Sans" w:cs="Google Sans" w:eastAsia="Google Sans" w:hAnsi="Google Sans"/>
+          <w:rtl w:val="0"/>
+        </w:rPr>
+        <w:t xml:space="preserve"> This 0% result brilliantly justifies the CodeQwen fine-tuning phase. It proves that throwing a larger, specialized model at a text-to-SQL problem is not a silver bullet. </w:t>
+      </w:r>
+      <w:r>
+        <w:rPr>
+          <w:rFonts w:ascii="Google Sans" w:cs="Google Sans" w:eastAsia="Google Sans" w:hAnsi="Google Sans"/>
+          <w:b w:val="1"/>
+          <w:bCs w:val="1"/>
+          <w:rtl w:val="0"/>
+        </w:rPr>
+        <w:t xml:space="preserve">Task-specific alignment (fine-tuning) is mandatory</w:t>
+      </w:r>
+      <w:r>
+        <w:rPr>
+          <w:rFonts w:ascii="Google Sans" w:cs="Google Sans" w:eastAsia="Google Sans" w:hAnsi="Google Sans"/>
+          <w:rtl w:val="0"/>
+        </w:rPr>
+        <w:t xml:space="preserve"> to bridge the gap between "knowing SQL" and "generating SQL that matches a specific database environment's expectations."</w:t>
+      </w:r>
+    </w:p>
+    <w:p>
+      <w:pPr>
+        <w:spacing w:after="240" w:before="240" w:line="275.9999942779541" w:lineRule="auto"/>
+        <w:rPr>
+          <w:rFonts w:ascii="Google Sans" w:cs="Google Sans" w:eastAsia="Google Sans" w:hAnsi="Google Sans"/>
+        </w:rPr>
+      </w:pPr>
+      <w:r>
+        <w:rPr>
+          <w:rtl w:val="0"/>
+        </w:rPr>
+      </w:r>
+    </w:p>
+    <w:p>
+      <w:pPr>
+        <w:pStyle w:val="Heading4"/>
+        <w:spacing w:after="40" w:before="240" w:line="275.9999942779541" w:lineRule="auto"/>
+        <w:rPr>
+          <w:rFonts w:ascii="Google Sans" w:cs="Google Sans" w:eastAsia="Google Sans" w:hAnsi="Google Sans"/>
+          <w:sz w:val="22"/>
+          <w:szCs w:val="22"/>
+        </w:rPr>
+      </w:pPr>
+      <w:bookmarkStart w:colFirst="0" w:colLast="0" w:name="_s0p9j3fua9ul" w:id="1"/>
+      <w:bookmarkEnd w:id="1"/>
+      <w:r>
+        <w:rPr>
+          <w:rFonts w:ascii="Google Sans" w:cs="Google Sans" w:eastAsia="Google Sans" w:hAnsi="Google Sans"/>
+          <w:sz w:val="22"/>
+          <w:szCs w:val="22"/>
+          <w:rtl w:val="0"/>
+        </w:rPr>
+        <w:t xml:space="preserve">NOTE: The Evaluation Typology (A, B, C)</w:t>
+      </w:r>
+    </w:p>
+    <w:p>
+      <w:pPr>
+        <w:spacing w:after="240" w:before="240" w:line="275.9999942779541" w:lineRule="auto"/>
+        <w:rPr>
+          <w:rFonts w:ascii="Google Sans" w:cs="Google Sans" w:eastAsia="Google Sans" w:hAnsi="Google Sans"/>
+        </w:rPr>
+      </w:pPr>
+      <w:r>
+        <w:rPr>
+          <w:rFonts w:ascii="Google Sans" w:cs="Google Sans" w:eastAsia="Google Sans" w:hAnsi="Google Sans"/>
+          <w:b w:val="1"/>
+          <w:bCs w:val="1"/>
+          <w:rtl w:val="0"/>
+        </w:rPr>
+        <w:t xml:space="preserve">Type A: Syntactic Variations &amp; String Literal Noise (Logical Success, Metric Failure)</w:t>
+      </w:r>
+      <w:r>
+        <w:rPr>
+          <w:rFonts w:ascii="Google Sans" w:cs="Google Sans" w:eastAsia="Google Sans" w:hAnsi="Google Sans"/>
+          <w:rtl w:val="0"/>
+        </w:rPr>
+        <w:t xml:space="preserve"> Many queries marked as "Failures" by the Exact Match metric were actually functionally flawless.</w:t>
+      </w:r>
+    </w:p>
+    <w:p>
+      <w:pPr>
+        <w:numPr>
+          <w:ilvl w:val="0"/>
+          <w:numId w:val="11"/>
+        </w:numPr>
+        <w:spacing w:after="0" w:afterAutospacing="0" w:before="240" w:line="275.9999942779541" w:lineRule="auto"/>
+        <w:ind w:left="720" w:hanging="360"/>
+        <w:rPr>
+          <w:rFonts w:ascii="Google Sans" w:cs="Google Sans" w:eastAsia="Google Sans" w:hAnsi="Google Sans"/>
+        </w:rPr>
+      </w:pPr>
+      <w:r>
+        <w:rPr>
+          <w:rFonts w:ascii="Google Sans" w:cs="Google Sans" w:eastAsia="Google Sans" w:hAnsi="Google Sans"/>
           <w:i w:val="1"/>
           <w:iCs w:val="1"/>
           <w:rtl w:val="0"/>
@@ -1569,7 +1883,7 @@
       <w:pPr>
         <w:numPr>
           <w:ilvl w:val="0"/>
-          <w:numId w:val="10"/>
+          <w:numId w:val="11"/>
         </w:numPr>
         <w:spacing w:after="0" w:afterAutospacing="0" w:before="0" w:beforeAutospacing="0" w:line="275.9999942779541" w:lineRule="auto"/>
         <w:ind w:left="720" w:hanging="360"/>
@@ -1628,7 +1942,7 @@
       <w:pPr>
         <w:numPr>
           <w:ilvl w:val="0"/>
-          <w:numId w:val="10"/>
+          <w:numId w:val="11"/>
         </w:numPr>
         <w:spacing w:after="240" w:before="0" w:beforeAutospacing="0" w:line="275.9999942779541" w:lineRule="auto"/>
         <w:ind w:left="720" w:hanging="360"/>
@@ -1879,7 +2193,7 @@
       <w:pPr>
         <w:numPr>
           <w:ilvl w:val="0"/>
-          <w:numId w:val="9"/>
+          <w:numId w:val="10"/>
         </w:numPr>
         <w:spacing w:after="240" w:before="240" w:line="275.9999942779541" w:lineRule="auto"/>
         <w:ind w:left="720" w:hanging="360"/>
@@ -2005,7 +2319,7 @@
       <w:pPr>
         <w:numPr>
           <w:ilvl w:val="0"/>
-          <w:numId w:val="8"/>
+          <w:numId w:val="9"/>
         </w:numPr>
         <w:pBdr>
           <w:top w:space="0" w:sz="0" w:val="nil"/>
@@ -2067,7 +2381,7 @@
       <w:pPr>
         <w:numPr>
           <w:ilvl w:val="0"/>
-          <w:numId w:val="8"/>
+          <w:numId w:val="9"/>
         </w:numPr>
         <w:pBdr>
           <w:top w:space="0" w:sz="0" w:val="nil"/>
@@ -2111,6 +2425,73 @@
           <w:rtl w:val="0"/>
         </w:rPr>
         <w:t xml:space="preserve"> the top 3 most relevant tables before sending the DDL to CodeQwen would significantly boost the Proximal Match rate by reducing the "noise" the model has to filter out.</w:t>
+      </w:r>
+    </w:p>
+    <w:p>
+      <w:pPr>
+        <w:numPr>
+          <w:ilvl w:val="0"/>
+          <w:numId w:val="9"/>
+        </w:numPr>
+        <w:spacing w:line="275.9999942779541" w:lineRule="auto"/>
+        <w:ind w:left="600" w:hanging="360"/>
+        <w:rPr>
+          <w:rFonts w:ascii="Google Sans" w:cs="Google Sans" w:eastAsia="Google Sans" w:hAnsi="Google Sans"/>
+        </w:rPr>
+      </w:pPr>
+      <w:r>
+        <w:rPr>
+          <w:rFonts w:ascii="Google Sans" w:cs="Google Sans" w:eastAsia="Google Sans" w:hAnsi="Google Sans"/>
+          <w:i w:val="1"/>
+          <w:iCs w:val="1"/>
+          <w:rtl w:val="0"/>
+        </w:rPr>
+        <w:t xml:space="preserve">Why:</w:t>
+      </w:r>
+      <w:r>
+        <w:rPr>
+          <w:rFonts w:ascii="Google Sans" w:cs="Google Sans" w:eastAsia="Google Sans" w:hAnsi="Google Sans"/>
+          <w:rtl w:val="0"/>
+        </w:rPr>
+        <w:t xml:space="preserve"> The 0% Exact Match score from Llama-3-SQLCoder-8B is the ultimate proof that string-matching metrics are fundamentally broken for SQL generation. A model can generate a functionally perfect, highly optimized query that yields the exact correct data, but fail an Exact Match test because it added an alias or a space. Future improvements </w:t>
+      </w:r>
+      <w:r>
+        <w:rPr>
+          <w:rFonts w:ascii="Google Sans" w:cs="Google Sans" w:eastAsia="Google Sans" w:hAnsi="Google Sans"/>
+          <w:i w:val="1"/>
+          <w:iCs w:val="1"/>
+          <w:rtl w:val="0"/>
+        </w:rPr>
+        <w:t xml:space="preserve">must</w:t>
+      </w:r>
+      <w:r>
+        <w:rPr>
+          <w:rFonts w:ascii="Google Sans" w:cs="Google Sans" w:eastAsia="Google Sans" w:hAnsi="Google Sans"/>
+          <w:rtl w:val="0"/>
+        </w:rPr>
+        <w:t xml:space="preserve"> implement a SQLite/Postgres execution sandbox. By executing both the predicted query and the ground truth query against a dummy database and comparing the resulting DataFrames, we would capture the true logical accuracy of the model, completely eliminating Type A failures.</w:t>
+      </w:r>
+    </w:p>
+    <w:p>
+      <w:pPr>
+        <w:pBdr>
+          <w:top w:space="0" w:sz="0" w:val="nil"/>
+          <w:left w:space="0" w:sz="0" w:val="nil"/>
+          <w:bottom w:space="0" w:sz="0" w:val="nil"/>
+          <w:right w:space="0" w:sz="0" w:val="nil"/>
+          <w:between w:space="0" w:sz="0" w:val="nil"/>
+        </w:pBdr>
+        <w:shd w:fill="auto" w:val="clear"/>
+        <w:spacing w:line="275.9999942779541" w:lineRule="auto"/>
+        <w:ind w:left="600" w:firstLine="0"/>
+        <w:rPr>
+          <w:rFonts w:ascii="Google Sans" w:cs="Google Sans" w:eastAsia="Google Sans" w:hAnsi="Google Sans"/>
+        </w:rPr>
+      </w:pPr>
+      <w:r>
+        <w:rPr>
+          <w:rtl w:val="0"/>
+        </w:rPr>
       </w:r>
     </w:p>
     <w:sectPr>
@@ -2351,22 +2732,10 @@
       <w:lvlText w:val="●"/>
       <w:lvlJc w:val="left"/>
       <w:pPr>
-        <w:ind w:left="600" w:hanging="360"/>
-      </w:pPr>
-      <w:rPr>
-        <w:rFonts w:ascii="Arial" w:cs="Arial" w:eastAsia="Arial" w:hAnsi="Arial"/>
-        <w:b w:val="0"/>
-        <w:bCs w:val="0"/>
-        <w:i w:val="0"/>
-        <w:iCs w:val="0"/>
-        <w:smallCaps w:val="0"/>
-        <w:strike w:val="0"/>
-        <w:color w:val="000000"/>
-        <w:sz w:val="22"/>
-        <w:szCs w:val="22"/>
-        <w:u w:val="none"/>
-        <w:shd w:fill="auto" w:val="clear"/>
-        <w:vertAlign w:val="baseline"/>
+        <w:ind w:left="720" w:hanging="360"/>
+      </w:pPr>
+      <w:rPr>
+        <w:u w:val="none"/>
       </w:rPr>
     </w:lvl>
     <w:lvl w:ilvl="1">
@@ -2378,19 +2747,7 @@
         <w:ind w:left="1440" w:hanging="360"/>
       </w:pPr>
       <w:rPr>
-        <w:rFonts w:ascii="Arial" w:cs="Arial" w:eastAsia="Arial" w:hAnsi="Arial"/>
-        <w:b w:val="0"/>
-        <w:bCs w:val="0"/>
-        <w:i w:val="0"/>
-        <w:iCs w:val="0"/>
-        <w:smallCaps w:val="0"/>
-        <w:strike w:val="0"/>
-        <w:color w:val="000000"/>
-        <w:sz w:val="22"/>
-        <w:szCs w:val="22"/>
-        <w:u w:val="none"/>
-        <w:shd w:fill="auto" w:val="clear"/>
-        <w:vertAlign w:val="baseline"/>
+        <w:u w:val="none"/>
       </w:rPr>
     </w:lvl>
     <w:lvl w:ilvl="2">
@@ -2402,67 +2759,31 @@
         <w:ind w:left="2160" w:hanging="360"/>
       </w:pPr>
       <w:rPr>
-        <w:rFonts w:ascii="Arial" w:cs="Arial" w:eastAsia="Arial" w:hAnsi="Arial"/>
-        <w:b w:val="0"/>
-        <w:bCs w:val="0"/>
-        <w:i w:val="0"/>
-        <w:iCs w:val="0"/>
-        <w:smallCaps w:val="0"/>
-        <w:strike w:val="0"/>
-        <w:color w:val="000000"/>
-        <w:sz w:val="22"/>
-        <w:szCs w:val="22"/>
-        <w:u w:val="none"/>
-        <w:shd w:fill="auto" w:val="clear"/>
-        <w:vertAlign w:val="baseline"/>
+        <w:u w:val="none"/>
       </w:rPr>
     </w:lvl>
     <w:lvl w:ilvl="3">
       <w:start w:val="1"/>
       <w:numFmt w:val="bullet"/>
-      <w:lvlText w:val="■"/>
+      <w:lvlText w:val="●"/>
       <w:lvlJc w:val="left"/>
       <w:pPr>
         <w:ind w:left="2880" w:hanging="360"/>
       </w:pPr>
       <w:rPr>
-        <w:rFonts w:ascii="Arial" w:cs="Arial" w:eastAsia="Arial" w:hAnsi="Arial"/>
-        <w:b w:val="0"/>
-        <w:bCs w:val="0"/>
-        <w:i w:val="0"/>
-        <w:iCs w:val="0"/>
-        <w:smallCaps w:val="0"/>
-        <w:strike w:val="0"/>
-        <w:color w:val="000000"/>
-        <w:sz w:val="22"/>
-        <w:szCs w:val="22"/>
-        <w:u w:val="none"/>
-        <w:shd w:fill="auto" w:val="clear"/>
-        <w:vertAlign w:val="baseline"/>
+        <w:u w:val="none"/>
       </w:rPr>
     </w:lvl>
     <w:lvl w:ilvl="4">
       <w:start w:val="1"/>
       <w:numFmt w:val="bullet"/>
-      <w:lvlText w:val="■"/>
+      <w:lvlText w:val="○"/>
       <w:lvlJc w:val="left"/>
       <w:pPr>
         <w:ind w:left="3600" w:hanging="360"/>
       </w:pPr>
       <w:rPr>
-        <w:rFonts w:ascii="Arial" w:cs="Arial" w:eastAsia="Arial" w:hAnsi="Arial"/>
-        <w:b w:val="0"/>
-        <w:bCs w:val="0"/>
-        <w:i w:val="0"/>
-        <w:iCs w:val="0"/>
-        <w:smallCaps w:val="0"/>
-        <w:strike w:val="0"/>
-        <w:color w:val="000000"/>
-        <w:sz w:val="22"/>
-        <w:szCs w:val="22"/>
-        <w:u w:val="none"/>
-        <w:shd w:fill="auto" w:val="clear"/>
-        <w:vertAlign w:val="baseline"/>
+        <w:u w:val="none"/>
       </w:rPr>
     </w:lvl>
     <w:lvl w:ilvl="5">
@@ -2474,67 +2795,31 @@
         <w:ind w:left="4320" w:hanging="360"/>
       </w:pPr>
       <w:rPr>
-        <w:rFonts w:ascii="Arial" w:cs="Arial" w:eastAsia="Arial" w:hAnsi="Arial"/>
-        <w:b w:val="0"/>
-        <w:bCs w:val="0"/>
-        <w:i w:val="0"/>
-        <w:iCs w:val="0"/>
-        <w:smallCaps w:val="0"/>
-        <w:strike w:val="0"/>
-        <w:color w:val="000000"/>
-        <w:sz w:val="22"/>
-        <w:szCs w:val="22"/>
-        <w:u w:val="none"/>
-        <w:shd w:fill="auto" w:val="clear"/>
-        <w:vertAlign w:val="baseline"/>
+        <w:u w:val="none"/>
       </w:rPr>
     </w:lvl>
     <w:lvl w:ilvl="6">
       <w:start w:val="1"/>
       <w:numFmt w:val="bullet"/>
-      <w:lvlText w:val="■"/>
+      <w:lvlText w:val="●"/>
       <w:lvlJc w:val="left"/>
       <w:pPr>
         <w:ind w:left="5040" w:hanging="360"/>
       </w:pPr>
       <w:rPr>
-        <w:rFonts w:ascii="Arial" w:cs="Arial" w:eastAsia="Arial" w:hAnsi="Arial"/>
-        <w:b w:val="0"/>
-        <w:bCs w:val="0"/>
-        <w:i w:val="0"/>
-        <w:iCs w:val="0"/>
-        <w:smallCaps w:val="0"/>
-        <w:strike w:val="0"/>
-        <w:color w:val="000000"/>
-        <w:sz w:val="22"/>
-        <w:szCs w:val="22"/>
-        <w:u w:val="none"/>
-        <w:shd w:fill="auto" w:val="clear"/>
-        <w:vertAlign w:val="baseline"/>
+        <w:u w:val="none"/>
       </w:rPr>
     </w:lvl>
     <w:lvl w:ilvl="7">
       <w:start w:val="1"/>
       <w:numFmt w:val="bullet"/>
-      <w:lvlText w:val="■"/>
+      <w:lvlText w:val="○"/>
       <w:lvlJc w:val="left"/>
       <w:pPr>
         <w:ind w:left="5760" w:hanging="360"/>
       </w:pPr>
       <w:rPr>
-        <w:rFonts w:ascii="Arial" w:cs="Arial" w:eastAsia="Arial" w:hAnsi="Arial"/>
-        <w:b w:val="0"/>
-        <w:bCs w:val="0"/>
-        <w:i w:val="0"/>
-        <w:iCs w:val="0"/>
-        <w:smallCaps w:val="0"/>
-        <w:strike w:val="0"/>
-        <w:color w:val="000000"/>
-        <w:sz w:val="22"/>
-        <w:szCs w:val="22"/>
-        <w:u w:val="none"/>
-        <w:shd w:fill="auto" w:val="clear"/>
-        <w:vertAlign w:val="baseline"/>
+        <w:u w:val="none"/>
       </w:rPr>
     </w:lvl>
     <w:lvl w:ilvl="8">
@@ -2546,27 +2831,15 @@
         <w:ind w:left="6480" w:hanging="360"/>
       </w:pPr>
       <w:rPr>
-        <w:rFonts w:ascii="Arial" w:cs="Arial" w:eastAsia="Arial" w:hAnsi="Arial"/>
-        <w:b w:val="0"/>
-        <w:bCs w:val="0"/>
-        <w:i w:val="0"/>
-        <w:iCs w:val="0"/>
-        <w:smallCaps w:val="0"/>
-        <w:strike w:val="0"/>
-        <w:color w:val="000000"/>
-        <w:sz w:val="22"/>
-        <w:szCs w:val="22"/>
-        <w:u w:val="none"/>
-        <w:shd w:fill="auto" w:val="clear"/>
-        <w:vertAlign w:val="baseline"/>
+        <w:u w:val="none"/>
       </w:rPr>
     </w:lvl>
   </w:abstractNum>
   <w:abstractNum w:abstractNumId="4">
     <w:lvl w:ilvl="0">
       <w:start w:val="1"/>
-      <w:numFmt w:val="decimal"/>
-      <w:lvlText w:val="%1."/>
+      <w:numFmt w:val="bullet"/>
+      <w:lvlText w:val="●"/>
       <w:lvlJc w:val="left"/>
       <w:pPr>
         <w:ind w:left="600" w:hanging="360"/>
@@ -2783,8 +3056,8 @@
   <w:abstractNum w:abstractNumId="5">
     <w:lvl w:ilvl="0">
       <w:start w:val="1"/>
-      <w:numFmt w:val="bullet"/>
-      <w:lvlText w:val="●"/>
+      <w:numFmt w:val="decimal"/>
+      <w:lvlText w:val="%1."/>
       <w:lvlJc w:val="left"/>
       <w:pPr>
         <w:ind w:left="600" w:hanging="360"/>
@@ -3029,7 +3302,7 @@
       <w:lvlText w:val="○"/>
       <w:lvlJc w:val="left"/>
       <w:pPr>
-        <w:ind w:left="1200" w:hanging="360"/>
+        <w:ind w:left="1440" w:hanging="360"/>
       </w:pPr>
       <w:rPr>
         <w:rFonts w:ascii="Arial" w:cs="Arial" w:eastAsia="Arial" w:hAnsi="Arial"/>
@@ -3465,7 +3738,7 @@
       <w:lvlText w:val="○"/>
       <w:lvlJc w:val="left"/>
       <w:pPr>
-        <w:ind w:left="1440" w:hanging="360"/>
+        <w:ind w:left="1200" w:hanging="360"/>
       </w:pPr>
       <w:rPr>
         <w:rFonts w:ascii="Arial" w:cs="Arial" w:eastAsia="Arial" w:hAnsi="Arial"/>
@@ -3659,10 +3932,22 @@
       <w:lvlText w:val="●"/>
       <w:lvlJc w:val="left"/>
       <w:pPr>
-        <w:ind w:left="720" w:hanging="360"/>
-      </w:pPr>
-      <w:rPr>
-        <w:u w:val="none"/>
+        <w:ind w:left="600" w:hanging="360"/>
+      </w:pPr>
+      <w:rPr>
+        <w:rFonts w:ascii="Arial" w:cs="Arial" w:eastAsia="Arial" w:hAnsi="Arial"/>
+        <w:b w:val="0"/>
+        <w:bCs w:val="0"/>
+        <w:i w:val="0"/>
+        <w:iCs w:val="0"/>
+        <w:smallCaps w:val="0"/>
+        <w:strike w:val="0"/>
+        <w:color w:val="000000"/>
+        <w:sz w:val="22"/>
+        <w:szCs w:val="22"/>
+        <w:u w:val="none"/>
+        <w:shd w:fill="auto" w:val="clear"/>
+        <w:vertAlign w:val="baseline"/>
       </w:rPr>
     </w:lvl>
     <w:lvl w:ilvl="1">
@@ -3674,7 +3959,19 @@
         <w:ind w:left="1440" w:hanging="360"/>
       </w:pPr>
       <w:rPr>
-        <w:u w:val="none"/>
+        <w:rFonts w:ascii="Arial" w:cs="Arial" w:eastAsia="Arial" w:hAnsi="Arial"/>
+        <w:b w:val="0"/>
+        <w:bCs w:val="0"/>
+        <w:i w:val="0"/>
+        <w:iCs w:val="0"/>
+        <w:smallCaps w:val="0"/>
+        <w:strike w:val="0"/>
+        <w:color w:val="000000"/>
+        <w:sz w:val="22"/>
+        <w:szCs w:val="22"/>
+        <w:u w:val="none"/>
+        <w:shd w:fill="auto" w:val="clear"/>
+        <w:vertAlign w:val="baseline"/>
       </w:rPr>
     </w:lvl>
     <w:lvl w:ilvl="2">
@@ -3686,31 +3983,67 @@
         <w:ind w:left="2160" w:hanging="360"/>
       </w:pPr>
       <w:rPr>
-        <w:u w:val="none"/>
+        <w:rFonts w:ascii="Arial" w:cs="Arial" w:eastAsia="Arial" w:hAnsi="Arial"/>
+        <w:b w:val="0"/>
+        <w:bCs w:val="0"/>
+        <w:i w:val="0"/>
+        <w:iCs w:val="0"/>
+        <w:smallCaps w:val="0"/>
+        <w:strike w:val="0"/>
+        <w:color w:val="000000"/>
+        <w:sz w:val="22"/>
+        <w:szCs w:val="22"/>
+        <w:u w:val="none"/>
+        <w:shd w:fill="auto" w:val="clear"/>
+        <w:vertAlign w:val="baseline"/>
       </w:rPr>
     </w:lvl>
     <w:lvl w:ilvl="3">
       <w:start w:val="1"/>
       <w:numFmt w:val="bullet"/>
-      <w:lvlText w:val="●"/>
+      <w:lvlText w:val="■"/>
       <w:lvlJc w:val="left"/>
       <w:pPr>
         <w:ind w:left="2880" w:hanging="360"/>
       </w:pPr>
       <w:rPr>
-        <w:u w:val="none"/>
+        <w:rFonts w:ascii="Arial" w:cs="Arial" w:eastAsia="Arial" w:hAnsi="Arial"/>
+        <w:b w:val="0"/>
+        <w:bCs w:val="0"/>
+        <w:i w:val="0"/>
+        <w:iCs w:val="0"/>
+        <w:smallCaps w:val="0"/>
+        <w:strike w:val="0"/>
+        <w:color w:val="000000"/>
+        <w:sz w:val="22"/>
+        <w:szCs w:val="22"/>
+        <w:u w:val="none"/>
+        <w:shd w:fill="auto" w:val="clear"/>
+        <w:vertAlign w:val="baseline"/>
       </w:rPr>
     </w:lvl>
     <w:lvl w:ilvl="4">
       <w:start w:val="1"/>
       <w:numFmt w:val="bullet"/>
-      <w:lvlText w:val="○"/>
+      <w:lvlText w:val="■"/>
       <w:lvlJc w:val="left"/>
       <w:pPr>
         <w:ind w:left="3600" w:hanging="360"/>
       </w:pPr>
       <w:rPr>
-        <w:u w:val="none"/>
+        <w:rFonts w:ascii="Arial" w:cs="Arial" w:eastAsia="Arial" w:hAnsi="Arial"/>
+        <w:b w:val="0"/>
+        <w:bCs w:val="0"/>
+        <w:i w:val="0"/>
+        <w:iCs w:val="0"/>
+        <w:smallCaps w:val="0"/>
+        <w:strike w:val="0"/>
+        <w:color w:val="000000"/>
+        <w:sz w:val="22"/>
+        <w:szCs w:val="22"/>
+        <w:u w:val="none"/>
+        <w:shd w:fill="auto" w:val="clear"/>
+        <w:vertAlign w:val="baseline"/>
       </w:rPr>
     </w:lvl>
     <w:lvl w:ilvl="5">
@@ -3722,31 +4055,67 @@
         <w:ind w:left="4320" w:hanging="360"/>
       </w:pPr>
       <w:rPr>
-        <w:u w:val="none"/>
+        <w:rFonts w:ascii="Arial" w:cs="Arial" w:eastAsia="Arial" w:hAnsi="Arial"/>
+        <w:b w:val="0"/>
+        <w:bCs w:val="0"/>
+        <w:i w:val="0"/>
+        <w:iCs w:val="0"/>
+        <w:smallCaps w:val="0"/>
+        <w:strike w:val="0"/>
+        <w:color w:val="000000"/>
+        <w:sz w:val="22"/>
+        <w:szCs w:val="22"/>
+        <w:u w:val="none"/>
+        <w:shd w:fill="auto" w:val="clear"/>
+        <w:vertAlign w:val="baseline"/>
       </w:rPr>
     </w:lvl>
     <w:lvl w:ilvl="6">
       <w:start w:val="1"/>
       <w:numFmt w:val="bullet"/>
-      <w:lvlText w:val="●"/>
+      <w:lvlText w:val="■"/>
       <w:lvlJc w:val="left"/>
       <w:pPr>
         <w:ind w:left="5040" w:hanging="360"/>
       </w:pPr>
       <w:rPr>
-        <w:u w:val="none"/>
+        <w:rFonts w:ascii="Arial" w:cs="Arial" w:eastAsia="Arial" w:hAnsi="Arial"/>
+        <w:b w:val="0"/>
+        <w:bCs w:val="0"/>
+        <w:i w:val="0"/>
+        <w:iCs w:val="0"/>
+        <w:smallCaps w:val="0"/>
+        <w:strike w:val="0"/>
+        <w:color w:val="000000"/>
+        <w:sz w:val="22"/>
+        <w:szCs w:val="22"/>
+        <w:u w:val="none"/>
+        <w:shd w:fill="auto" w:val="clear"/>
+        <w:vertAlign w:val="baseline"/>
       </w:rPr>
     </w:lvl>
     <w:lvl w:ilvl="7">
       <w:start w:val="1"/>
       <w:numFmt w:val="bullet"/>
-      <w:lvlText w:val="○"/>
+      <w:lvlText w:val="■"/>
       <w:lvlJc w:val="left"/>
       <w:pPr>
         <w:ind w:left="5760" w:hanging="360"/>
       </w:pPr>
       <w:rPr>
-        <w:u w:val="none"/>
+        <w:rFonts w:ascii="Arial" w:cs="Arial" w:eastAsia="Arial" w:hAnsi="Arial"/>
+        <w:b w:val="0"/>
+        <w:bCs w:val="0"/>
+        <w:i w:val="0"/>
+        <w:iCs w:val="0"/>
+        <w:smallCaps w:val="0"/>
+        <w:strike w:val="0"/>
+        <w:color w:val="000000"/>
+        <w:sz w:val="22"/>
+        <w:szCs w:val="22"/>
+        <w:u w:val="none"/>
+        <w:shd w:fill="auto" w:val="clear"/>
+        <w:vertAlign w:val="baseline"/>
       </w:rPr>
     </w:lvl>
     <w:lvl w:ilvl="8">
@@ -3758,11 +4127,133 @@
         <w:ind w:left="6480" w:hanging="360"/>
       </w:pPr>
       <w:rPr>
-        <w:u w:val="none"/>
+        <w:rFonts w:ascii="Arial" w:cs="Arial" w:eastAsia="Arial" w:hAnsi="Arial"/>
+        <w:b w:val="0"/>
+        <w:bCs w:val="0"/>
+        <w:i w:val="0"/>
+        <w:iCs w:val="0"/>
+        <w:smallCaps w:val="0"/>
+        <w:strike w:val="0"/>
+        <w:color w:val="000000"/>
+        <w:sz w:val="22"/>
+        <w:szCs w:val="22"/>
+        <w:u w:val="none"/>
+        <w:shd w:fill="auto" w:val="clear"/>
+        <w:vertAlign w:val="baseline"/>
       </w:rPr>
     </w:lvl>
   </w:abstractNum>
   <w:abstractNum w:abstractNumId="10">
+    <w:lvl w:ilvl="0">
+      <w:start w:val="1"/>
+      <w:numFmt w:val="bullet"/>
+      <w:lvlText w:val="●"/>
+      <w:lvlJc w:val="left"/>
+      <w:pPr>
+        <w:ind w:left="720" w:hanging="360"/>
+      </w:pPr>
+      <w:rPr>
+        <w:u w:val="none"/>
+      </w:rPr>
+    </w:lvl>
+    <w:lvl w:ilvl="1">
+      <w:start w:val="1"/>
+      <w:numFmt w:val="bullet"/>
+      <w:lvlText w:val="○"/>
+      <w:lvlJc w:val="left"/>
+      <w:pPr>
+        <w:ind w:left="1440" w:hanging="360"/>
+      </w:pPr>
+      <w:rPr>
+        <w:u w:val="none"/>
+      </w:rPr>
+    </w:lvl>
+    <w:lvl w:ilvl="2">
+      <w:start w:val="1"/>
+      <w:numFmt w:val="bullet"/>
+      <w:lvlText w:val="■"/>
+      <w:lvlJc w:val="left"/>
+      <w:pPr>
+        <w:ind w:left="2160" w:hanging="360"/>
+      </w:pPr>
+      <w:rPr>
+        <w:u w:val="none"/>
+      </w:rPr>
+    </w:lvl>
+    <w:lvl w:ilvl="3">
+      <w:start w:val="1"/>
+      <w:numFmt w:val="bullet"/>
+      <w:lvlText w:val="●"/>
+      <w:lvlJc w:val="left"/>
+      <w:pPr>
+        <w:ind w:left="2880" w:hanging="360"/>
+      </w:pPr>
+      <w:rPr>
+        <w:u w:val="none"/>
+      </w:rPr>
+    </w:lvl>
+    <w:lvl w:ilvl="4">
+      <w:start w:val="1"/>
+      <w:numFmt w:val="bullet"/>
+      <w:lvlText w:val="○"/>
+      <w:lvlJc w:val="left"/>
+      <w:pPr>
+        <w:ind w:left="3600" w:hanging="360"/>
+      </w:pPr>
+      <w:rPr>
+        <w:u w:val="none"/>
+      </w:rPr>
+    </w:lvl>
+    <w:lvl w:ilvl="5">
+      <w:start w:val="1"/>
+      <w:numFmt w:val="bullet"/>
+      <w:lvlText w:val="■"/>
+      <w:lvlJc w:val="left"/>
+      <w:pPr>
+        <w:ind w:left="4320" w:hanging="360"/>
+      </w:pPr>
+      <w:rPr>
+        <w:u w:val="none"/>
+      </w:rPr>
+    </w:lvl>
+    <w:lvl w:ilvl="6">
+      <w:start w:val="1"/>
+      <w:numFmt w:val="bullet"/>
+      <w:lvlText w:val="●"/>
+      <w:lvlJc w:val="left"/>
+      <w:pPr>
+        <w:ind w:left="5040" w:hanging="360"/>
+      </w:pPr>
+      <w:rPr>
+        <w:u w:val="none"/>
+      </w:rPr>
+    </w:lvl>
+    <w:lvl w:ilvl="7">
+      <w:start w:val="1"/>
+      <w:numFmt w:val="bullet"/>
+      <w:lvlText w:val="○"/>
+      <w:lvlJc w:val="left"/>
+      <w:pPr>
+        <w:ind w:left="5760" w:hanging="360"/>
+      </w:pPr>
+      <w:rPr>
+        <w:u w:val="none"/>
+      </w:rPr>
+    </w:lvl>
+    <w:lvl w:ilvl="8">
+      <w:start w:val="1"/>
+      <w:numFmt w:val="bullet"/>
+      <w:lvlText w:val="■"/>
+      <w:lvlJc w:val="left"/>
+      <w:pPr>
+        <w:ind w:left="6480" w:hanging="360"/>
+      </w:pPr>
+      <w:rPr>
+        <w:u w:val="none"/>
+      </w:rPr>
+    </w:lvl>
+  </w:abstractNum>
+  <w:abstractNum w:abstractNumId="11">
     <w:lvl w:ilvl="0">
       <w:start w:val="1"/>
       <w:numFmt w:val="bullet"/>
@@ -3901,6 +4392,9 @@
   </w:num>
   <w:num w:numId="10">
     <w:abstractNumId w:val="10"/>
+  </w:num>
+  <w:num w:numId="11">
+    <w:abstractNumId w:val="11"/>
   </w:num>
 </w:numbering>
 </file>

</xml_diff>